<commit_message>
docs: localize thesis figures and demo profile
</commit_message>
<xml_diff>
--- a/毕业论文_初稿_格式化.docx
+++ b/毕业论文_初稿_格式化.docx
@@ -159,7 +159,7 @@
         <w:spacing w:before="240" w:after="240"/>
         <w:jc w:val="center"/>
       </w:pPr>
-      <w:bookmarkStart w:id="1" w:name="_Toc229235074"/>
+      <w:bookmarkStart w:id="1" w:name="_Toc229254561"/>
       <w:r>
         <w:rPr>
           <w:rFonts w:ascii="Times New Roman" w:eastAsia="黑体" w:hAnsi="Times New Roman"/>
@@ -448,7 +448,7 @@
         <w:spacing w:before="240" w:after="240"/>
         <w:jc w:val="center"/>
       </w:pPr>
-      <w:bookmarkStart w:id="2" w:name="_Toc229235075"/>
+      <w:bookmarkStart w:id="2" w:name="_Toc229254562"/>
       <w:r>
         <w:rPr>
           <w:rFonts w:ascii="Times New Roman" w:eastAsia="黑体" w:hAnsi="Times New Roman"/>
@@ -586,7 +586,7 @@
       <w:r>
         <w:fldChar w:fldCharType="separate"/>
       </w:r>
-      <w:hyperlink w:anchor="_Toc229235074" w:history="1">
+      <w:hyperlink w:anchor="_Toc229254561" w:history="1">
         <w:r>
           <w:rPr>
             <w:rStyle w:val="aff9"/>
@@ -614,7 +614,7 @@
             <w:noProof/>
             <w:webHidden/>
           </w:rPr>
-          <w:instrText xml:space="preserve"> PAGEREF _Toc229235074 \h </w:instrText>
+          <w:instrText xml:space="preserve"> PAGEREF _Toc229254561 \h </w:instrText>
         </w:r>
         <w:r>
           <w:rPr>
@@ -655,7 +655,7 @@
           <w:noProof/>
         </w:rPr>
       </w:pPr>
-      <w:hyperlink w:anchor="_Toc229235075" w:history="1">
+      <w:hyperlink w:anchor="_Toc229254562" w:history="1">
         <w:r>
           <w:rPr>
             <w:rStyle w:val="aff9"/>
@@ -683,7 +683,7 @@
             <w:noProof/>
             <w:webHidden/>
           </w:rPr>
-          <w:instrText xml:space="preserve"> PAGEREF _Toc229235075 \h </w:instrText>
+          <w:instrText xml:space="preserve"> PAGEREF _Toc229254562 \h </w:instrText>
         </w:r>
         <w:r>
           <w:rPr>
@@ -724,7 +724,7 @@
           <w:noProof/>
         </w:rPr>
       </w:pPr>
-      <w:hyperlink w:anchor="_Toc229235076" w:history="1">
+      <w:hyperlink w:anchor="_Toc229254563" w:history="1">
         <w:r>
           <w:rPr>
             <w:rStyle w:val="aff9"/>
@@ -768,7 +768,7 @@
             <w:noProof/>
             <w:webHidden/>
           </w:rPr>
-          <w:instrText xml:space="preserve"> PAGEREF _Toc229235076 \h </w:instrText>
+          <w:instrText xml:space="preserve"> PAGEREF _Toc229254563 \h </w:instrText>
         </w:r>
         <w:r>
           <w:rPr>
@@ -810,7 +810,7 @@
           <w:noProof/>
         </w:rPr>
       </w:pPr>
-      <w:hyperlink w:anchor="_Toc229235077" w:history="1">
+      <w:hyperlink w:anchor="_Toc229254564" w:history="1">
         <w:r>
           <w:rPr>
             <w:rStyle w:val="aff9"/>
@@ -846,7 +846,7 @@
             <w:noProof/>
             <w:webHidden/>
           </w:rPr>
-          <w:instrText xml:space="preserve"> PAGEREF _Toc229235077 \h </w:instrText>
+          <w:instrText xml:space="preserve"> PAGEREF _Toc229254564 \h </w:instrText>
         </w:r>
         <w:r>
           <w:rPr>
@@ -888,7 +888,7 @@
           <w:noProof/>
         </w:rPr>
       </w:pPr>
-      <w:hyperlink w:anchor="_Toc229235078" w:history="1">
+      <w:hyperlink w:anchor="_Toc229254565" w:history="1">
         <w:r>
           <w:rPr>
             <w:rStyle w:val="aff9"/>
@@ -924,7 +924,7 @@
             <w:noProof/>
             <w:webHidden/>
           </w:rPr>
-          <w:instrText xml:space="preserve"> PAGEREF _Toc229235078 \h </w:instrText>
+          <w:instrText xml:space="preserve"> PAGEREF _Toc229254565 \h </w:instrText>
         </w:r>
         <w:r>
           <w:rPr>
@@ -966,7 +966,7 @@
           <w:noProof/>
         </w:rPr>
       </w:pPr>
-      <w:hyperlink w:anchor="_Toc229235079" w:history="1">
+      <w:hyperlink w:anchor="_Toc229254566" w:history="1">
         <w:r>
           <w:rPr>
             <w:rStyle w:val="aff9"/>
@@ -1002,7 +1002,7 @@
             <w:noProof/>
             <w:webHidden/>
           </w:rPr>
-          <w:instrText xml:space="preserve"> PAGEREF _Toc229235079 \h </w:instrText>
+          <w:instrText xml:space="preserve"> PAGEREF _Toc229254566 \h </w:instrText>
         </w:r>
         <w:r>
           <w:rPr>
@@ -1044,7 +1044,7 @@
           <w:noProof/>
         </w:rPr>
       </w:pPr>
-      <w:hyperlink w:anchor="_Toc229235080" w:history="1">
+      <w:hyperlink w:anchor="_Toc229254567" w:history="1">
         <w:r>
           <w:rPr>
             <w:rStyle w:val="aff9"/>
@@ -1080,7 +1080,7 @@
             <w:noProof/>
             <w:webHidden/>
           </w:rPr>
-          <w:instrText xml:space="preserve"> PAGEREF _Toc229235080 \h </w:instrText>
+          <w:instrText xml:space="preserve"> PAGEREF _Toc229254567 \h </w:instrText>
         </w:r>
         <w:r>
           <w:rPr>
@@ -1121,7 +1121,7 @@
           <w:noProof/>
         </w:rPr>
       </w:pPr>
-      <w:hyperlink w:anchor="_Toc229235081" w:history="1">
+      <w:hyperlink w:anchor="_Toc229254568" w:history="1">
         <w:r>
           <w:rPr>
             <w:rStyle w:val="aff9"/>
@@ -1165,7 +1165,7 @@
             <w:noProof/>
             <w:webHidden/>
           </w:rPr>
-          <w:instrText xml:space="preserve"> PAGEREF _Toc229235081 \h </w:instrText>
+          <w:instrText xml:space="preserve"> PAGEREF _Toc229254568 \h </w:instrText>
         </w:r>
         <w:r>
           <w:rPr>
@@ -1207,7 +1207,7 @@
           <w:noProof/>
         </w:rPr>
       </w:pPr>
-      <w:hyperlink w:anchor="_Toc229235082" w:history="1">
+      <w:hyperlink w:anchor="_Toc229254569" w:history="1">
         <w:r>
           <w:rPr>
             <w:rStyle w:val="aff9"/>
@@ -1243,7 +1243,7 @@
             <w:noProof/>
             <w:webHidden/>
           </w:rPr>
-          <w:instrText xml:space="preserve"> PAGEREF _Toc229235082 \h </w:instrText>
+          <w:instrText xml:space="preserve"> PAGEREF _Toc229254569 \h </w:instrText>
         </w:r>
         <w:r>
           <w:rPr>
@@ -1285,7 +1285,7 @@
           <w:noProof/>
         </w:rPr>
       </w:pPr>
-      <w:hyperlink w:anchor="_Toc229235083" w:history="1">
+      <w:hyperlink w:anchor="_Toc229254570" w:history="1">
         <w:r>
           <w:rPr>
             <w:rStyle w:val="aff9"/>
@@ -1321,7 +1321,7 @@
             <w:noProof/>
             <w:webHidden/>
           </w:rPr>
-          <w:instrText xml:space="preserve"> PAGEREF _Toc229235083 \h </w:instrText>
+          <w:instrText xml:space="preserve"> PAGEREF _Toc229254570 \h </w:instrText>
         </w:r>
         <w:r>
           <w:rPr>
@@ -1363,7 +1363,7 @@
           <w:noProof/>
         </w:rPr>
       </w:pPr>
-      <w:hyperlink w:anchor="_Toc229235084" w:history="1">
+      <w:hyperlink w:anchor="_Toc229254571" w:history="1">
         <w:r>
           <w:rPr>
             <w:rStyle w:val="aff9"/>
@@ -1399,7 +1399,7 @@
             <w:noProof/>
             <w:webHidden/>
           </w:rPr>
-          <w:instrText xml:space="preserve"> PAGEREF _Toc229235084 \h </w:instrText>
+          <w:instrText xml:space="preserve"> PAGEREF _Toc229254571 \h </w:instrText>
         </w:r>
         <w:r>
           <w:rPr>
@@ -1440,7 +1440,7 @@
           <w:noProof/>
         </w:rPr>
       </w:pPr>
-      <w:hyperlink w:anchor="_Toc229235085" w:history="1">
+      <w:hyperlink w:anchor="_Toc229254572" w:history="1">
         <w:r>
           <w:rPr>
             <w:rStyle w:val="aff9"/>
@@ -1484,7 +1484,7 @@
             <w:noProof/>
             <w:webHidden/>
           </w:rPr>
-          <w:instrText xml:space="preserve"> PAGEREF _Toc229235085 \h </w:instrText>
+          <w:instrText xml:space="preserve"> PAGEREF _Toc229254572 \h </w:instrText>
         </w:r>
         <w:r>
           <w:rPr>
@@ -1526,7 +1526,7 @@
           <w:noProof/>
         </w:rPr>
       </w:pPr>
-      <w:hyperlink w:anchor="_Toc229235086" w:history="1">
+      <w:hyperlink w:anchor="_Toc229254573" w:history="1">
         <w:r>
           <w:rPr>
             <w:rStyle w:val="aff9"/>
@@ -1562,7 +1562,7 @@
             <w:noProof/>
             <w:webHidden/>
           </w:rPr>
-          <w:instrText xml:space="preserve"> PAGEREF _Toc229235086 \h </w:instrText>
+          <w:instrText xml:space="preserve"> PAGEREF _Toc229254573 \h </w:instrText>
         </w:r>
         <w:r>
           <w:rPr>
@@ -1604,7 +1604,7 @@
           <w:noProof/>
         </w:rPr>
       </w:pPr>
-      <w:hyperlink w:anchor="_Toc229235087" w:history="1">
+      <w:hyperlink w:anchor="_Toc229254574" w:history="1">
         <w:r>
           <w:rPr>
             <w:rStyle w:val="aff9"/>
@@ -1640,7 +1640,7 @@
             <w:noProof/>
             <w:webHidden/>
           </w:rPr>
-          <w:instrText xml:space="preserve"> PAGEREF _Toc229235087 \h </w:instrText>
+          <w:instrText xml:space="preserve"> PAGEREF _Toc229254574 \h </w:instrText>
         </w:r>
         <w:r>
           <w:rPr>
@@ -1682,7 +1682,7 @@
           <w:noProof/>
         </w:rPr>
       </w:pPr>
-      <w:hyperlink w:anchor="_Toc229235088" w:history="1">
+      <w:hyperlink w:anchor="_Toc229254575" w:history="1">
         <w:r>
           <w:rPr>
             <w:rStyle w:val="aff9"/>
@@ -1718,7 +1718,7 @@
             <w:noProof/>
             <w:webHidden/>
           </w:rPr>
-          <w:instrText xml:space="preserve"> PAGEREF _Toc229235088 \h </w:instrText>
+          <w:instrText xml:space="preserve"> PAGEREF _Toc229254575 \h </w:instrText>
         </w:r>
         <w:r>
           <w:rPr>
@@ -1760,7 +1760,7 @@
           <w:noProof/>
         </w:rPr>
       </w:pPr>
-      <w:hyperlink w:anchor="_Toc229235089" w:history="1">
+      <w:hyperlink w:anchor="_Toc229254576" w:history="1">
         <w:r>
           <w:rPr>
             <w:rStyle w:val="aff9"/>
@@ -1796,7 +1796,7 @@
             <w:noProof/>
             <w:webHidden/>
           </w:rPr>
-          <w:instrText xml:space="preserve"> PAGEREF _Toc229235089 \h </w:instrText>
+          <w:instrText xml:space="preserve"> PAGEREF _Toc229254576 \h </w:instrText>
         </w:r>
         <w:r>
           <w:rPr>
@@ -1837,7 +1837,7 @@
           <w:noProof/>
         </w:rPr>
       </w:pPr>
-      <w:hyperlink w:anchor="_Toc229235090" w:history="1">
+      <w:hyperlink w:anchor="_Toc229254577" w:history="1">
         <w:r>
           <w:rPr>
             <w:rStyle w:val="aff9"/>
@@ -1881,7 +1881,7 @@
             <w:noProof/>
             <w:webHidden/>
           </w:rPr>
-          <w:instrText xml:space="preserve"> PAGEREF _Toc229235090 \h </w:instrText>
+          <w:instrText xml:space="preserve"> PAGEREF _Toc229254577 \h </w:instrText>
         </w:r>
         <w:r>
           <w:rPr>
@@ -1923,7 +1923,7 @@
           <w:noProof/>
         </w:rPr>
       </w:pPr>
-      <w:hyperlink w:anchor="_Toc229235091" w:history="1">
+      <w:hyperlink w:anchor="_Toc229254578" w:history="1">
         <w:r>
           <w:rPr>
             <w:rStyle w:val="aff9"/>
@@ -1959,7 +1959,7 @@
             <w:noProof/>
             <w:webHidden/>
           </w:rPr>
-          <w:instrText xml:space="preserve"> PAGEREF _Toc229235091 \h </w:instrText>
+          <w:instrText xml:space="preserve"> PAGEREF _Toc229254578 \h </w:instrText>
         </w:r>
         <w:r>
           <w:rPr>
@@ -2001,7 +2001,7 @@
           <w:noProof/>
         </w:rPr>
       </w:pPr>
-      <w:hyperlink w:anchor="_Toc229235092" w:history="1">
+      <w:hyperlink w:anchor="_Toc229254579" w:history="1">
         <w:r>
           <w:rPr>
             <w:rStyle w:val="aff9"/>
@@ -2037,7 +2037,7 @@
             <w:noProof/>
             <w:webHidden/>
           </w:rPr>
-          <w:instrText xml:space="preserve"> PAGEREF _Toc229235092 \h </w:instrText>
+          <w:instrText xml:space="preserve"> PAGEREF _Toc229254579 \h </w:instrText>
         </w:r>
         <w:r>
           <w:rPr>
@@ -2079,7 +2079,7 @@
           <w:noProof/>
         </w:rPr>
       </w:pPr>
-      <w:hyperlink w:anchor="_Toc229235093" w:history="1">
+      <w:hyperlink w:anchor="_Toc229254580" w:history="1">
         <w:r>
           <w:rPr>
             <w:rStyle w:val="aff9"/>
@@ -2115,7 +2115,7 @@
             <w:noProof/>
             <w:webHidden/>
           </w:rPr>
-          <w:instrText xml:space="preserve"> PAGEREF _Toc229235093 \h </w:instrText>
+          <w:instrText xml:space="preserve"> PAGEREF _Toc229254580 \h </w:instrText>
         </w:r>
         <w:r>
           <w:rPr>
@@ -2157,7 +2157,7 @@
           <w:noProof/>
         </w:rPr>
       </w:pPr>
-      <w:hyperlink w:anchor="_Toc229235094" w:history="1">
+      <w:hyperlink w:anchor="_Toc229254581" w:history="1">
         <w:r>
           <w:rPr>
             <w:rStyle w:val="aff9"/>
@@ -2193,7 +2193,7 @@
             <w:noProof/>
             <w:webHidden/>
           </w:rPr>
-          <w:instrText xml:space="preserve"> PAGEREF _Toc229235094 \h </w:instrText>
+          <w:instrText xml:space="preserve"> PAGEREF _Toc229254581 \h </w:instrText>
         </w:r>
         <w:r>
           <w:rPr>
@@ -2235,7 +2235,7 @@
           <w:noProof/>
         </w:rPr>
       </w:pPr>
-      <w:hyperlink w:anchor="_Toc229235095" w:history="1">
+      <w:hyperlink w:anchor="_Toc229254582" w:history="1">
         <w:r>
           <w:rPr>
             <w:rStyle w:val="aff9"/>
@@ -2271,7 +2271,7 @@
             <w:noProof/>
             <w:webHidden/>
           </w:rPr>
-          <w:instrText xml:space="preserve"> PAGEREF _Toc229235095 \h </w:instrText>
+          <w:instrText xml:space="preserve"> PAGEREF _Toc229254582 \h </w:instrText>
         </w:r>
         <w:r>
           <w:rPr>
@@ -2312,7 +2312,7 @@
           <w:noProof/>
         </w:rPr>
       </w:pPr>
-      <w:hyperlink w:anchor="_Toc229235096" w:history="1">
+      <w:hyperlink w:anchor="_Toc229254583" w:history="1">
         <w:r>
           <w:rPr>
             <w:rStyle w:val="aff9"/>
@@ -2356,7 +2356,7 @@
             <w:noProof/>
             <w:webHidden/>
           </w:rPr>
-          <w:instrText xml:space="preserve"> PAGEREF _Toc229235096 \h </w:instrText>
+          <w:instrText xml:space="preserve"> PAGEREF _Toc229254583 \h </w:instrText>
         </w:r>
         <w:r>
           <w:rPr>
@@ -2398,7 +2398,7 @@
           <w:noProof/>
         </w:rPr>
       </w:pPr>
-      <w:hyperlink w:anchor="_Toc229235097" w:history="1">
+      <w:hyperlink w:anchor="_Toc229254584" w:history="1">
         <w:r>
           <w:rPr>
             <w:rStyle w:val="aff9"/>
@@ -2434,7 +2434,7 @@
             <w:noProof/>
             <w:webHidden/>
           </w:rPr>
-          <w:instrText xml:space="preserve"> PAGEREF _Toc229235097 \h </w:instrText>
+          <w:instrText xml:space="preserve"> PAGEREF _Toc229254584 \h </w:instrText>
         </w:r>
         <w:r>
           <w:rPr>
@@ -2476,7 +2476,7 @@
           <w:noProof/>
         </w:rPr>
       </w:pPr>
-      <w:hyperlink w:anchor="_Toc229235098" w:history="1">
+      <w:hyperlink w:anchor="_Toc229254585" w:history="1">
         <w:r>
           <w:rPr>
             <w:rStyle w:val="aff9"/>
@@ -2512,7 +2512,7 @@
             <w:noProof/>
             <w:webHidden/>
           </w:rPr>
-          <w:instrText xml:space="preserve"> PAGEREF _Toc229235098 \h </w:instrText>
+          <w:instrText xml:space="preserve"> PAGEREF _Toc229254585 \h </w:instrText>
         </w:r>
         <w:r>
           <w:rPr>
@@ -2554,7 +2554,7 @@
           <w:noProof/>
         </w:rPr>
       </w:pPr>
-      <w:hyperlink w:anchor="_Toc229235099" w:history="1">
+      <w:hyperlink w:anchor="_Toc229254586" w:history="1">
         <w:r>
           <w:rPr>
             <w:rStyle w:val="aff9"/>
@@ -2590,7 +2590,7 @@
             <w:noProof/>
             <w:webHidden/>
           </w:rPr>
-          <w:instrText xml:space="preserve"> PAGEREF _Toc229235099 \h </w:instrText>
+          <w:instrText xml:space="preserve"> PAGEREF _Toc229254586 \h </w:instrText>
         </w:r>
         <w:r>
           <w:rPr>
@@ -2610,7 +2610,7 @@
             <w:noProof/>
             <w:webHidden/>
           </w:rPr>
-          <w:t>12</w:t>
+          <w:t>13</w:t>
         </w:r>
         <w:r>
           <w:rPr>
@@ -2632,7 +2632,7 @@
           <w:noProof/>
         </w:rPr>
       </w:pPr>
-      <w:hyperlink w:anchor="_Toc229235100" w:history="1">
+      <w:hyperlink w:anchor="_Toc229254587" w:history="1">
         <w:r>
           <w:rPr>
             <w:rStyle w:val="aff9"/>
@@ -2668,7 +2668,7 @@
             <w:noProof/>
             <w:webHidden/>
           </w:rPr>
-          <w:instrText xml:space="preserve"> PAGEREF _Toc229235100 \h </w:instrText>
+          <w:instrText xml:space="preserve"> PAGEREF _Toc229254587 \h </w:instrText>
         </w:r>
         <w:r>
           <w:rPr>
@@ -2688,7 +2688,7 @@
             <w:noProof/>
             <w:webHidden/>
           </w:rPr>
-          <w:t>13</w:t>
+          <w:t>14</w:t>
         </w:r>
         <w:r>
           <w:rPr>
@@ -2710,7 +2710,7 @@
           <w:noProof/>
         </w:rPr>
       </w:pPr>
-      <w:hyperlink w:anchor="_Toc229235101" w:history="1">
+      <w:hyperlink w:anchor="_Toc229254588" w:history="1">
         <w:r>
           <w:rPr>
             <w:rStyle w:val="aff9"/>
@@ -2746,7 +2746,7 @@
             <w:noProof/>
             <w:webHidden/>
           </w:rPr>
-          <w:instrText xml:space="preserve"> PAGEREF _Toc229235101 \h </w:instrText>
+          <w:instrText xml:space="preserve"> PAGEREF _Toc229254588 \h </w:instrText>
         </w:r>
         <w:r>
           <w:rPr>
@@ -2766,7 +2766,7 @@
             <w:noProof/>
             <w:webHidden/>
           </w:rPr>
-          <w:t>14</w:t>
+          <w:t>15</w:t>
         </w:r>
         <w:r>
           <w:rPr>
@@ -2788,7 +2788,7 @@
           <w:noProof/>
         </w:rPr>
       </w:pPr>
-      <w:hyperlink w:anchor="_Toc229235102" w:history="1">
+      <w:hyperlink w:anchor="_Toc229254589" w:history="1">
         <w:r>
           <w:rPr>
             <w:rStyle w:val="aff9"/>
@@ -2824,7 +2824,7 @@
             <w:noProof/>
             <w:webHidden/>
           </w:rPr>
-          <w:instrText xml:space="preserve"> PAGEREF _Toc229235102 \h </w:instrText>
+          <w:instrText xml:space="preserve"> PAGEREF _Toc229254589 \h </w:instrText>
         </w:r>
         <w:r>
           <w:rPr>
@@ -2844,7 +2844,7 @@
             <w:noProof/>
             <w:webHidden/>
           </w:rPr>
-          <w:t>15</w:t>
+          <w:t>16</w:t>
         </w:r>
         <w:r>
           <w:rPr>
@@ -2865,7 +2865,7 @@
           <w:noProof/>
         </w:rPr>
       </w:pPr>
-      <w:hyperlink w:anchor="_Toc229235103" w:history="1">
+      <w:hyperlink w:anchor="_Toc229254590" w:history="1">
         <w:r>
           <w:rPr>
             <w:rStyle w:val="aff9"/>
@@ -2909,7 +2909,7 @@
             <w:noProof/>
             <w:webHidden/>
           </w:rPr>
-          <w:instrText xml:space="preserve"> PAGEREF _Toc229235103 \h </w:instrText>
+          <w:instrText xml:space="preserve"> PAGEREF _Toc229254590 \h </w:instrText>
         </w:r>
         <w:r>
           <w:rPr>
@@ -2929,7 +2929,7 @@
             <w:noProof/>
             <w:webHidden/>
           </w:rPr>
-          <w:t>16</w:t>
+          <w:t>18</w:t>
         </w:r>
         <w:r>
           <w:rPr>
@@ -2950,7 +2950,7 @@
           <w:noProof/>
         </w:rPr>
       </w:pPr>
-      <w:hyperlink w:anchor="_Toc229235104" w:history="1">
+      <w:hyperlink w:anchor="_Toc229254591" w:history="1">
         <w:r>
           <w:rPr>
             <w:rStyle w:val="aff9"/>
@@ -2994,7 +2994,7 @@
             <w:noProof/>
             <w:webHidden/>
           </w:rPr>
-          <w:instrText xml:space="preserve"> PAGEREF _Toc229235104 \h </w:instrText>
+          <w:instrText xml:space="preserve"> PAGEREF _Toc229254591 \h </w:instrText>
         </w:r>
         <w:r>
           <w:rPr>
@@ -3014,7 +3014,7 @@
             <w:noProof/>
             <w:webHidden/>
           </w:rPr>
-          <w:t>17</w:t>
+          <w:t>20</w:t>
         </w:r>
         <w:r>
           <w:rPr>
@@ -3035,7 +3035,7 @@
           <w:noProof/>
         </w:rPr>
       </w:pPr>
-      <w:hyperlink w:anchor="_Toc229235105" w:history="1">
+      <w:hyperlink w:anchor="_Toc229254592" w:history="1">
         <w:r>
           <w:rPr>
             <w:rStyle w:val="aff9"/>
@@ -3079,7 +3079,7 @@
             <w:noProof/>
             <w:webHidden/>
           </w:rPr>
-          <w:instrText xml:space="preserve"> PAGEREF _Toc229235105 \h </w:instrText>
+          <w:instrText xml:space="preserve"> PAGEREF _Toc229254592 \h </w:instrText>
         </w:r>
         <w:r>
           <w:rPr>
@@ -3099,7 +3099,7 @@
             <w:noProof/>
             <w:webHidden/>
           </w:rPr>
-          <w:t>18</w:t>
+          <w:t>21</w:t>
         </w:r>
         <w:r>
           <w:rPr>
@@ -3120,7 +3120,7 @@
           <w:noProof/>
         </w:rPr>
       </w:pPr>
-      <w:hyperlink w:anchor="_Toc229235106" w:history="1">
+      <w:hyperlink w:anchor="_Toc229254593" w:history="1">
         <w:r>
           <w:rPr>
             <w:rStyle w:val="aff9"/>
@@ -3148,7 +3148,7 @@
             <w:noProof/>
             <w:webHidden/>
           </w:rPr>
-          <w:instrText xml:space="preserve"> PAGEREF _Toc229235106 \h </w:instrText>
+          <w:instrText xml:space="preserve"> PAGEREF _Toc229254593 \h </w:instrText>
         </w:r>
         <w:r>
           <w:rPr>
@@ -3168,7 +3168,7 @@
             <w:noProof/>
             <w:webHidden/>
           </w:rPr>
-          <w:t>19</w:t>
+          <w:t>22</w:t>
         </w:r>
         <w:r>
           <w:rPr>
@@ -3189,7 +3189,7 @@
           <w:noProof/>
         </w:rPr>
       </w:pPr>
-      <w:hyperlink w:anchor="_Toc229235107" w:history="1">
+      <w:hyperlink w:anchor="_Toc229254594" w:history="1">
         <w:r>
           <w:rPr>
             <w:rStyle w:val="aff9"/>
@@ -3217,7 +3217,7 @@
             <w:noProof/>
             <w:webHidden/>
           </w:rPr>
-          <w:instrText xml:space="preserve"> PAGEREF _Toc229235107 \h </w:instrText>
+          <w:instrText xml:space="preserve"> PAGEREF _Toc229254594 \h </w:instrText>
         </w:r>
         <w:r>
           <w:rPr>
@@ -3237,7 +3237,7 @@
             <w:noProof/>
             <w:webHidden/>
           </w:rPr>
-          <w:t>20</w:t>
+          <w:t>23</w:t>
         </w:r>
         <w:r>
           <w:rPr>
@@ -3264,7 +3264,7 @@
         <w:spacing w:before="240" w:after="240"/>
         <w:jc w:val="center"/>
       </w:pPr>
-      <w:bookmarkStart w:id="3" w:name="_Toc229235076"/>
+      <w:bookmarkStart w:id="3" w:name="_Toc229254563"/>
       <w:r>
         <w:rPr>
           <w:rFonts w:ascii="Times New Roman" w:eastAsia="黑体" w:hAnsi="Times New Roman"/>
@@ -3291,7 +3291,7 @@
         <w:pStyle w:val="21"/>
         <w:spacing w:after="120"/>
       </w:pPr>
-      <w:bookmarkStart w:id="4" w:name="_Toc229235077"/>
+      <w:bookmarkStart w:id="4" w:name="_Toc229254564"/>
       <w:r>
         <w:rPr>
           <w:rFonts w:ascii="Times New Roman" w:eastAsia="黑体" w:hAnsi="Times New Roman"/>
@@ -3370,7 +3370,7 @@
         <w:pStyle w:val="21"/>
         <w:spacing w:after="120"/>
       </w:pPr>
-      <w:bookmarkStart w:id="5" w:name="_Toc229235078"/>
+      <w:bookmarkStart w:id="5" w:name="_Toc229254565"/>
       <w:r>
         <w:rPr>
           <w:rFonts w:ascii="Times New Roman" w:eastAsia="黑体" w:hAnsi="Times New Roman"/>
@@ -3403,7 +3403,7 @@
         <w:pStyle w:val="21"/>
         <w:spacing w:after="120"/>
       </w:pPr>
-      <w:bookmarkStart w:id="6" w:name="_Toc229235079"/>
+      <w:bookmarkStart w:id="6" w:name="_Toc229254566"/>
       <w:r>
         <w:rPr>
           <w:rFonts w:ascii="Times New Roman" w:eastAsia="黑体" w:hAnsi="Times New Roman"/>
@@ -3621,7 +3621,7 @@
         <w:pStyle w:val="21"/>
         <w:spacing w:after="120"/>
       </w:pPr>
-      <w:bookmarkStart w:id="7" w:name="_Toc229235080"/>
+      <w:bookmarkStart w:id="7" w:name="_Toc229254567"/>
       <w:r>
         <w:rPr>
           <w:rFonts w:ascii="Times New Roman" w:eastAsia="黑体" w:hAnsi="Times New Roman"/>
@@ -3732,7 +3732,7 @@
         <w:spacing w:before="240" w:after="240"/>
         <w:jc w:val="center"/>
       </w:pPr>
-      <w:bookmarkStart w:id="8" w:name="_Toc229235081"/>
+      <w:bookmarkStart w:id="8" w:name="_Toc229254568"/>
       <w:r>
         <w:rPr>
           <w:rFonts w:ascii="Times New Roman" w:eastAsia="黑体" w:hAnsi="Times New Roman"/>
@@ -3759,7 +3759,7 @@
         <w:pStyle w:val="21"/>
         <w:spacing w:after="120"/>
       </w:pPr>
-      <w:bookmarkStart w:id="9" w:name="_Toc229235082"/>
+      <w:bookmarkStart w:id="9" w:name="_Toc229254569"/>
       <w:r>
         <w:rPr>
           <w:rFonts w:ascii="Times New Roman" w:eastAsia="黑体" w:hAnsi="Times New Roman"/>
@@ -3880,7 +3880,7 @@
         <w:pStyle w:val="21"/>
         <w:spacing w:after="120"/>
       </w:pPr>
-      <w:bookmarkStart w:id="10" w:name="_Toc229235083"/>
+      <w:bookmarkStart w:id="10" w:name="_Toc229254570"/>
       <w:r>
         <w:rPr>
           <w:rFonts w:ascii="Times New Roman" w:eastAsia="黑体" w:hAnsi="Times New Roman"/>
@@ -3934,7 +3934,7 @@
         <w:pStyle w:val="21"/>
         <w:spacing w:after="120"/>
       </w:pPr>
-      <w:bookmarkStart w:id="11" w:name="_Toc229235084"/>
+      <w:bookmarkStart w:id="11" w:name="_Toc229254571"/>
       <w:r>
         <w:rPr>
           <w:rFonts w:ascii="Times New Roman" w:eastAsia="黑体" w:hAnsi="Times New Roman"/>
@@ -4087,7 +4087,7 @@
         <w:spacing w:before="240" w:after="240"/>
         <w:jc w:val="center"/>
       </w:pPr>
-      <w:bookmarkStart w:id="12" w:name="_Toc229235085"/>
+      <w:bookmarkStart w:id="12" w:name="_Toc229254572"/>
       <w:r>
         <w:rPr>
           <w:rFonts w:ascii="Times New Roman" w:eastAsia="黑体" w:hAnsi="Times New Roman"/>
@@ -4114,7 +4114,7 @@
         <w:pStyle w:val="21"/>
         <w:spacing w:after="120"/>
       </w:pPr>
-      <w:bookmarkStart w:id="13" w:name="_Toc229235086"/>
+      <w:bookmarkStart w:id="13" w:name="_Toc229254573"/>
       <w:r>
         <w:rPr>
           <w:rFonts w:ascii="Times New Roman" w:eastAsia="黑体" w:hAnsi="Times New Roman"/>
@@ -4171,7 +4171,7 @@
         <w:pStyle w:val="21"/>
         <w:spacing w:after="120"/>
       </w:pPr>
-      <w:bookmarkStart w:id="14" w:name="_Toc229235087"/>
+      <w:bookmarkStart w:id="14" w:name="_Toc229254574"/>
       <w:r>
         <w:rPr>
           <w:rFonts w:ascii="Times New Roman" w:eastAsia="黑体" w:hAnsi="Times New Roman"/>
@@ -4255,7 +4255,7 @@
         <w:pStyle w:val="21"/>
         <w:spacing w:after="120"/>
       </w:pPr>
-      <w:bookmarkStart w:id="15" w:name="_Toc229235088"/>
+      <w:bookmarkStart w:id="15" w:name="_Toc229254575"/>
       <w:r>
         <w:rPr>
           <w:rFonts w:ascii="Times New Roman" w:eastAsia="黑体" w:hAnsi="Times New Roman"/>
@@ -4333,7 +4333,7 @@
         <w:pStyle w:val="21"/>
         <w:spacing w:after="120"/>
       </w:pPr>
-      <w:bookmarkStart w:id="16" w:name="_Toc229235089"/>
+      <w:bookmarkStart w:id="16" w:name="_Toc229254576"/>
       <w:r>
         <w:rPr>
           <w:rFonts w:ascii="Times New Roman" w:eastAsia="黑体" w:hAnsi="Times New Roman"/>
@@ -4466,7 +4466,7 @@
         <w:spacing w:before="240" w:after="240"/>
         <w:jc w:val="center"/>
       </w:pPr>
-      <w:bookmarkStart w:id="17" w:name="_Toc229235090"/>
+      <w:bookmarkStart w:id="17" w:name="_Toc229254577"/>
       <w:r>
         <w:rPr>
           <w:rFonts w:ascii="Times New Roman" w:eastAsia="黑体" w:hAnsi="Times New Roman"/>
@@ -4493,7 +4493,7 @@
         <w:pStyle w:val="21"/>
         <w:spacing w:after="120"/>
       </w:pPr>
-      <w:bookmarkStart w:id="18" w:name="_Toc229235091"/>
+      <w:bookmarkStart w:id="18" w:name="_Toc229254578"/>
       <w:r>
         <w:rPr>
           <w:rFonts w:ascii="Times New Roman" w:eastAsia="黑体" w:hAnsi="Times New Roman"/>
@@ -4568,7 +4568,7 @@
         <w:pStyle w:val="21"/>
         <w:spacing w:after="120"/>
       </w:pPr>
-      <w:bookmarkStart w:id="19" w:name="_Toc229235092"/>
+      <w:bookmarkStart w:id="19" w:name="_Toc229254579"/>
       <w:r>
         <w:rPr>
           <w:rFonts w:ascii="Times New Roman" w:eastAsia="黑体" w:hAnsi="Times New Roman"/>
@@ -4670,7 +4670,7 @@
         <w:pStyle w:val="21"/>
         <w:spacing w:after="120"/>
       </w:pPr>
-      <w:bookmarkStart w:id="20" w:name="_Toc229235093"/>
+      <w:bookmarkStart w:id="20" w:name="_Toc229254580"/>
       <w:r>
         <w:rPr>
           <w:rFonts w:ascii="Times New Roman" w:eastAsia="黑体" w:hAnsi="Times New Roman"/>
@@ -4769,7 +4769,7 @@
         <w:pStyle w:val="21"/>
         <w:spacing w:after="120"/>
       </w:pPr>
-      <w:bookmarkStart w:id="21" w:name="_Toc229235094"/>
+      <w:bookmarkStart w:id="21" w:name="_Toc229254581"/>
       <w:r>
         <w:rPr>
           <w:rFonts w:ascii="Times New Roman" w:eastAsia="黑体" w:hAnsi="Times New Roman"/>
@@ -4839,7 +4839,7 @@
         <w:pStyle w:val="21"/>
         <w:spacing w:after="120"/>
       </w:pPr>
-      <w:bookmarkStart w:id="22" w:name="_Toc229235095"/>
+      <w:bookmarkStart w:id="22" w:name="_Toc229254582"/>
       <w:r>
         <w:rPr>
           <w:rFonts w:ascii="Times New Roman" w:eastAsia="黑体" w:hAnsi="Times New Roman"/>
@@ -4982,7 +4982,7 @@
         <w:spacing w:before="240" w:after="240"/>
         <w:jc w:val="center"/>
       </w:pPr>
-      <w:bookmarkStart w:id="23" w:name="_Toc229235096"/>
+      <w:bookmarkStart w:id="23" w:name="_Toc229254583"/>
       <w:r>
         <w:rPr>
           <w:rFonts w:ascii="Times New Roman" w:eastAsia="黑体" w:hAnsi="Times New Roman"/>
@@ -5009,7 +5009,7 @@
         <w:pStyle w:val="21"/>
         <w:spacing w:after="120"/>
       </w:pPr>
-      <w:bookmarkStart w:id="24" w:name="_Toc229235097"/>
+      <w:bookmarkStart w:id="24" w:name="_Toc229254584"/>
       <w:r>
         <w:rPr>
           <w:rFonts w:ascii="Times New Roman" w:eastAsia="黑体" w:hAnsi="Times New Roman"/>
@@ -5099,7 +5099,7 @@
         <w:pStyle w:val="21"/>
         <w:spacing w:after="120"/>
       </w:pPr>
-      <w:bookmarkStart w:id="25" w:name="_Toc229235098"/>
+      <w:bookmarkStart w:id="25" w:name="_Toc229254585"/>
       <w:r>
         <w:rPr>
           <w:rFonts w:ascii="Times New Roman" w:eastAsia="黑体" w:hAnsi="Times New Roman"/>
@@ -5231,10 +5231,117 @@
     </w:p>
     <w:p>
       <w:pPr>
+        <w:jc w:val="center"/>
+      </w:pPr>
+      <w:r>
+        <w:rPr>
+          <w:noProof/>
+        </w:rPr>
+        <w:drawing>
+          <wp:inline distT="0" distB="0" distL="0" distR="0">
+            <wp:extent cx="5486400" cy="4171478"/>
+            <wp:effectExtent l="0" t="0" r="0" b="0"/>
+            <wp:docPr id="1" name="Picture 1"/>
+            <wp:cNvGraphicFramePr>
+              <a:graphicFrameLocks xmlns:a="http://schemas.openxmlformats.org/drawingml/2006/main" noChangeAspect="1"/>
+            </wp:cNvGraphicFramePr>
+            <a:graphic xmlns:a="http://schemas.openxmlformats.org/drawingml/2006/main">
+              <a:graphicData uri="http://schemas.openxmlformats.org/drawingml/2006/picture">
+                <pic:pic xmlns:pic="http://schemas.openxmlformats.org/drawingml/2006/picture">
+                  <pic:nvPicPr>
+                    <pic:cNvPr id="0" name="pitted_surface_refinement_grid.png"/>
+                    <pic:cNvPicPr/>
+                  </pic:nvPicPr>
+                  <pic:blipFill>
+                    <a:blip r:embed="rId8"/>
+                    <a:stretch>
+                      <a:fillRect/>
+                    </a:stretch>
+                  </pic:blipFill>
+                  <pic:spPr>
+                    <a:xfrm>
+                      <a:off x="0" y="0"/>
+                      <a:ext cx="5486400" cy="4171478"/>
+                    </a:xfrm>
+                    <a:prstGeom prst="rect">
+                      <a:avLst/>
+                    </a:prstGeom>
+                  </pic:spPr>
+                </pic:pic>
+              </a:graphicData>
+            </a:graphic>
+          </wp:inline>
+        </w:drawing>
+      </w:r>
+    </w:p>
+    <w:p>
+      <w:pPr>
+        <w:spacing w:after="120"/>
+        <w:jc w:val="center"/>
+      </w:pPr>
+      <w:r>
+        <w:rPr>
+          <w:sz w:val="21"/>
+        </w:rPr>
+        <w:lastRenderedPageBreak/>
+        <w:t>图</w:t>
+      </w:r>
+      <w:r>
+        <w:rPr>
+          <w:sz w:val="21"/>
+        </w:rPr>
+        <w:t xml:space="preserve"> 1 </w:t>
+      </w:r>
+      <w:r>
+        <w:rPr>
+          <w:sz w:val="21"/>
+        </w:rPr>
+        <w:t>麻点缺陷生成样本迭代对比</w:t>
+      </w:r>
+    </w:p>
+    <w:p>
+      <w:pPr>
+        <w:spacing w:after="0" w:line="360" w:lineRule="auto"/>
+        <w:ind w:firstLine="480"/>
+        <w:jc w:val="both"/>
+      </w:pPr>
+      <w:r>
+        <w:t>图中以麻点缺陷为例，对比真实</w:t>
+      </w:r>
+      <w:r>
+        <w:t xml:space="preserve"> ROI</w:t>
+      </w:r>
+      <w:r>
+        <w:t>、</w:t>
+      </w:r>
+      <w:r>
+        <w:t xml:space="preserve">20 </w:t>
+      </w:r>
+      <w:r>
+        <w:t>轮原始生成样本、</w:t>
+      </w:r>
+      <w:r>
+        <w:t xml:space="preserve">20 </w:t>
+      </w:r>
+      <w:r>
+        <w:t>轮后处理</w:t>
+      </w:r>
+      <w:r>
+        <w:t>筛选样本和</w:t>
+      </w:r>
+      <w:r>
+        <w:t xml:space="preserve"> 40 </w:t>
+      </w:r>
+      <w:r>
+        <w:t>轮筛选样本。该类样本在早期实验中较容易出现纹理偏平滑、灰度对比不足的问题，因此适合作为困难类别观察对象。经过后处理、筛选和继续训练后，生成图像的局部纹理更接近真实缺陷，低对比度样本数量减少，为后续比例消融和下游分类验证提供了较可靠的样本基础。</w:t>
+      </w:r>
+    </w:p>
+    <w:p>
+      <w:pPr>
         <w:pStyle w:val="21"/>
         <w:spacing w:after="120"/>
       </w:pPr>
-      <w:bookmarkStart w:id="26" w:name="_Toc229235099"/>
+      <w:bookmarkStart w:id="26" w:name="_Toc229254586"/>
       <w:r>
         <w:rPr>
           <w:rFonts w:ascii="Times New Roman" w:eastAsia="黑体" w:hAnsi="Times New Roman"/>
@@ -5271,10 +5378,7 @@
         <w:t>张筛选</w:t>
       </w:r>
       <w:r>
-        <w:t xml:space="preserve"> GAN</w:t>
-      </w:r>
-      <w:r>
-        <w:t xml:space="preserve"> </w:t>
+        <w:t xml:space="preserve"> GAN </w:t>
       </w:r>
       <w:r>
         <w:t>样本后提升到</w:t>
@@ -5307,7 +5411,10 @@
         <w:t xml:space="preserve">4 </w:t>
       </w:r>
       <w:r>
-        <w:t>月继续训练和筛选后，</w:t>
+        <w:t>月继续</w:t>
+      </w:r>
+      <w:r>
+        <w:t>训练和筛选后，</w:t>
       </w:r>
       <w:r>
         <w:t xml:space="preserve">cGAN-v2 40 </w:t>
@@ -5479,15 +5586,7 @@
                 <w:b/>
                 <w:sz w:val="21"/>
               </w:rPr>
-              <w:t>最终验证准确</w:t>
-            </w:r>
-            <w:r>
-              <w:rPr>
-                <w:rFonts w:eastAsia="黑体"/>
-                <w:b/>
-                <w:sz w:val="21"/>
-              </w:rPr>
-              <w:t>率</w:t>
+              <w:t>最终验证准确率</w:t>
             </w:r>
           </w:p>
         </w:tc>
@@ -5817,7 +5916,6 @@
         <w:jc w:val="both"/>
       </w:pPr>
       <w:r>
-        <w:lastRenderedPageBreak/>
         <w:t>从表中可以看到，</w:t>
       </w:r>
       <w:r>
@@ -5865,11 +5963,12 @@
         <w:rPr>
           <w:noProof/>
         </w:rPr>
+        <w:lastRenderedPageBreak/>
         <w:drawing>
           <wp:inline distT="0" distB="0" distL="0" distR="0">
-            <wp:extent cx="5212080" cy="2552856"/>
+            <wp:extent cx="5486400" cy="2648607"/>
             <wp:effectExtent l="0" t="0" r="0" b="0"/>
-            <wp:docPr id="1" name="Picture 1"/>
+            <wp:docPr id="2" name="Picture 2"/>
             <wp:cNvGraphicFramePr>
               <a:graphicFrameLocks xmlns:a="http://schemas.openxmlformats.org/drawingml/2006/main" noChangeAspect="1"/>
             </wp:cNvGraphicFramePr>
@@ -5881,7 +5980,7 @@
                     <pic:cNvPicPr/>
                   </pic:nvPicPr>
                   <pic:blipFill>
-                    <a:blip r:embed="rId8"/>
+                    <a:blip r:embed="rId9"/>
                     <a:stretch>
                       <a:fillRect/>
                     </a:stretch>
@@ -5889,7 +5988,7 @@
                   <pic:spPr>
                     <a:xfrm>
                       <a:off x="0" y="0"/>
-                      <a:ext cx="5212080" cy="2552856"/>
+                      <a:ext cx="5486400" cy="2648607"/>
                     </a:xfrm>
                     <a:prstGeom prst="rect">
                       <a:avLst/>
@@ -5917,7 +6016,7 @@
         <w:rPr>
           <w:sz w:val="21"/>
         </w:rPr>
-        <w:t xml:space="preserve"> 1 cGAN-v2 40</w:t>
+        <w:t xml:space="preserve"> 2 cGAN-v2 40</w:t>
       </w:r>
       <w:r>
         <w:rPr>
@@ -5928,10 +6027,44 @@
     </w:p>
     <w:p>
       <w:pPr>
+        <w:spacing w:after="0" w:line="360" w:lineRule="auto"/>
+        <w:ind w:firstLine="480"/>
+        <w:jc w:val="both"/>
+      </w:pPr>
+      <w:r>
+        <w:t>该图同时展示最佳验证准确率、最终验证准确率和最佳验证损失。每类</w:t>
+      </w:r>
+      <w:r>
+        <w:t xml:space="preserve"> 25 </w:t>
+      </w:r>
+      <w:r>
+        <w:t>张和</w:t>
+      </w:r>
+      <w:r>
+        <w:t xml:space="preserve"> 50 </w:t>
+      </w:r>
+      <w:r>
+        <w:t>张方案虽然已经带来一定提升，但最终准确率存在回落；每类</w:t>
+      </w:r>
+      <w:r>
+        <w:t xml:space="preserve"> 100 </w:t>
+      </w:r>
+      <w:r>
+        <w:t>张、共</w:t>
+      </w:r>
+      <w:r>
+        <w:t xml:space="preserve"> 600 </w:t>
+      </w:r>
+      <w:r>
+        <w:t>张方案在准确率和损失两方面均表现最好，说明当生成模型质量达到一定水平后，适当增加高质量生成样本可以继续改善分类器训练效果。</w:t>
+      </w:r>
+    </w:p>
+    <w:p>
+      <w:pPr>
         <w:pStyle w:val="21"/>
         <w:spacing w:after="120"/>
       </w:pPr>
-      <w:bookmarkStart w:id="27" w:name="_Toc229235100"/>
+      <w:bookmarkStart w:id="27" w:name="_Toc229254587"/>
       <w:r>
         <w:rPr>
           <w:rFonts w:ascii="Times New Roman" w:eastAsia="黑体" w:hAnsi="Times New Roman"/>
@@ -6177,7 +6310,13 @@
               <w:rPr>
                 <w:sz w:val="21"/>
               </w:rPr>
-              <w:t>98.15%</w:t>
+              <w:t>9</w:t>
+            </w:r>
+            <w:r>
+              <w:rPr>
+                <w:sz w:val="21"/>
+              </w:rPr>
+              <w:t>8.15%</w:t>
             </w:r>
           </w:p>
         </w:tc>
@@ -6444,9 +6583,9 @@
         <w:lastRenderedPageBreak/>
         <w:drawing>
           <wp:inline distT="0" distB="0" distL="0" distR="0">
-            <wp:extent cx="5212080" cy="1903542"/>
+            <wp:extent cx="5486400" cy="2000166"/>
             <wp:effectExtent l="0" t="0" r="0" b="0"/>
-            <wp:docPr id="2" name="Picture 2"/>
+            <wp:docPr id="3" name="Picture 3"/>
             <wp:cNvGraphicFramePr>
               <a:graphicFrameLocks xmlns:a="http://schemas.openxmlformats.org/drawingml/2006/main" noChangeAspect="1"/>
             </wp:cNvGraphicFramePr>
@@ -6458,7 +6597,7 @@
                     <pic:cNvPicPr/>
                   </pic:nvPicPr>
                   <pic:blipFill>
-                    <a:blip r:embed="rId9"/>
+                    <a:blip r:embed="rId10"/>
                     <a:stretch>
                       <a:fillRect/>
                     </a:stretch>
@@ -6466,7 +6605,7 @@
                   <pic:spPr>
                     <a:xfrm>
                       <a:off x="0" y="0"/>
-                      <a:ext cx="5212080" cy="1903542"/>
+                      <a:ext cx="5486400" cy="2000166"/>
                     </a:xfrm>
                     <a:prstGeom prst="rect">
                       <a:avLst/>
@@ -6494,13 +6633,53 @@
         <w:rPr>
           <w:sz w:val="21"/>
         </w:rPr>
-        <w:t xml:space="preserve"> 2 </w:t>
+        <w:t xml:space="preserve"> 3</w:t>
+      </w:r>
+      <w:r>
+        <w:rPr>
+          <w:sz w:val="21"/>
+        </w:rPr>
+        <w:t xml:space="preserve"> </w:t>
       </w:r>
       <w:r>
         <w:rPr>
           <w:sz w:val="21"/>
         </w:rPr>
         <w:t>工业应用门槛对比</w:t>
+      </w:r>
+    </w:p>
+    <w:p>
+      <w:pPr>
+        <w:spacing w:after="0" w:line="360" w:lineRule="auto"/>
+        <w:ind w:firstLine="480"/>
+        <w:jc w:val="both"/>
+      </w:pPr>
+      <w:r>
+        <w:t>工业应用门槛图将总体最佳准确率、最低类别召回率和代价加权错误率放在同一张图中。</w:t>
+      </w:r>
+      <w:r>
+        <w:t xml:space="preserve">300 </w:t>
+      </w:r>
+      <w:r>
+        <w:t>张方案虽然准确率接近要求，但最低类别召回率未达到</w:t>
+      </w:r>
+      <w:r>
+        <w:t xml:space="preserve"> 95% </w:t>
+      </w:r>
+      <w:r>
+        <w:t>门槛，说明仍存在较明显的类别漏检风险。</w:t>
+      </w:r>
+      <w:r>
+        <w:t xml:space="preserve">600 </w:t>
+      </w:r>
+      <w:r>
+        <w:t>张方案在三个指标上均达到设定门槛，特别是最低类别召回率提升到</w:t>
+      </w:r>
+      <w:r>
+        <w:t xml:space="preserve"> 98.33%</w:t>
+      </w:r>
+      <w:r>
+        <w:t>，因此更适合作为后续试运行方案。</w:t>
       </w:r>
     </w:p>
     <w:p>
@@ -6513,9 +6692,9 @@
         </w:rPr>
         <w:drawing>
           <wp:inline distT="0" distB="0" distL="0" distR="0">
-            <wp:extent cx="5212080" cy="2084832"/>
+            <wp:extent cx="5486400" cy="2190078"/>
             <wp:effectExtent l="0" t="0" r="0" b="0"/>
-            <wp:docPr id="3" name="Picture 3"/>
+            <wp:docPr id="4" name="Picture 4"/>
             <wp:cNvGraphicFramePr>
               <a:graphicFrameLocks xmlns:a="http://schemas.openxmlformats.org/drawingml/2006/main" noChangeAspect="1"/>
             </wp:cNvGraphicFramePr>
@@ -6527,7 +6706,7 @@
                     <pic:cNvPicPr/>
                   </pic:nvPicPr>
                   <pic:blipFill>
-                    <a:blip r:embed="rId10"/>
+                    <a:blip r:embed="rId11"/>
                     <a:stretch>
                       <a:fillRect/>
                     </a:stretch>
@@ -6535,7 +6714,7 @@
                   <pic:spPr>
                     <a:xfrm>
                       <a:off x="0" y="0"/>
-                      <a:ext cx="5212080" cy="2084832"/>
+                      <a:ext cx="5486400" cy="2190078"/>
                     </a:xfrm>
                     <a:prstGeom prst="rect">
                       <a:avLst/>
@@ -6563,7 +6742,7 @@
         <w:rPr>
           <w:sz w:val="21"/>
         </w:rPr>
-        <w:t xml:space="preserve"> 3 600</w:t>
+        <w:t xml:space="preserve"> 4 600</w:t>
       </w:r>
       <w:r>
         <w:rPr>
@@ -6574,10 +6753,53 @@
     </w:p>
     <w:p>
       <w:pPr>
+        <w:spacing w:after="0" w:line="360" w:lineRule="auto"/>
+        <w:ind w:firstLine="480"/>
+        <w:jc w:val="both"/>
+      </w:pPr>
+      <w:r>
+        <w:t>多随机种子图用于说明实验结论不是单次随机训练的偶然结果。三个随机种子下，</w:t>
+      </w:r>
+      <w:r>
+        <w:t xml:space="preserve">cGAN-v2 600 </w:t>
+      </w:r>
+      <w:r>
+        <w:t>张增强组在最佳准确率和最佳损失上整体优于原始基线，平均最佳</w:t>
+      </w:r>
+      <w:r>
+        <w:t>准确率从</w:t>
+      </w:r>
+      <w:r>
+        <w:t xml:space="preserve"> 98.15% </w:t>
+      </w:r>
+      <w:r>
+        <w:t>提升到</w:t>
+      </w:r>
+      <w:r>
+        <w:t xml:space="preserve"> 99.44%</w:t>
+      </w:r>
+      <w:r>
+        <w:t>。该结果增强了论文结论的稳定性，也能在答辩中回应</w:t>
+      </w:r>
+      <w:r>
+        <w:t>“</w:t>
+      </w:r>
+      <w:r>
+        <w:t>是否只跑了一次</w:t>
+      </w:r>
+      <w:r>
+        <w:t>”</w:t>
+      </w:r>
+      <w:r>
+        <w:t>的追问。</w:t>
+      </w:r>
+    </w:p>
+    <w:p>
+      <w:pPr>
         <w:pStyle w:val="21"/>
         <w:spacing w:after="120"/>
       </w:pPr>
-      <w:bookmarkStart w:id="28" w:name="_Toc229235101"/>
+      <w:bookmarkStart w:id="28" w:name="_Toc229254588"/>
       <w:r>
         <w:rPr>
           <w:rFonts w:ascii="Times New Roman" w:eastAsia="黑体" w:hAnsi="Times New Roman"/>
@@ -6608,10 +6830,7 @@
         <w:t>，系统增加</w:t>
       </w:r>
       <w:r>
-        <w:t xml:space="preserve"> Res</w:t>
-      </w:r>
-      <w:r>
-        <w:t xml:space="preserve">Net18 </w:t>
+        <w:t xml:space="preserve"> ResNet18 </w:t>
       </w:r>
       <w:r>
         <w:t>和</w:t>
@@ -6668,7 +6887,11 @@
         <w:t xml:space="preserve"> 93.33%</w:t>
       </w:r>
       <w:r>
-        <w:t>。结果说明，更复杂的</w:t>
+        <w:t>。结果说明，更复杂</w:t>
+      </w:r>
+      <w:r>
+        <w:lastRenderedPageBreak/>
+        <w:t>的</w:t>
       </w:r>
       <w:r>
         <w:t xml:space="preserve"> backbone </w:t>
@@ -6692,10 +6915,7 @@
         <w:t xml:space="preserve"> pitted-surface</w:t>
       </w:r>
       <w:r>
-        <w:t>，</w:t>
-      </w:r>
-      <w:r>
-        <w:t>与前文困难类别分析一致。</w:t>
+        <w:t>，与前文困难类别分析一致。</w:t>
       </w:r>
     </w:p>
     <w:p>
@@ -6738,7 +6958,10 @@
         <w:t>分类图，没有对应</w:t>
       </w:r>
       <w:r>
-        <w:t xml:space="preserve"> bbox</w:t>
+        <w:t xml:space="preserve"> </w:t>
+      </w:r>
+      <w:r>
+        <w:t>bbox</w:t>
       </w:r>
       <w:r>
         <w:t>，后续若要用于检测增强，需要研究带框生成或将</w:t>
@@ -6755,12 +6978,11 @@
         <w:pStyle w:val="21"/>
         <w:spacing w:after="120"/>
       </w:pPr>
-      <w:bookmarkStart w:id="29" w:name="_Toc229235102"/>
+      <w:bookmarkStart w:id="29" w:name="_Toc229254589"/>
       <w:r>
         <w:rPr>
           <w:rFonts w:ascii="Times New Roman" w:eastAsia="黑体" w:hAnsi="Times New Roman"/>
         </w:rPr>
-        <w:lastRenderedPageBreak/>
         <w:t xml:space="preserve">5.6 </w:t>
       </w:r>
       <w:r>
@@ -6796,10 +7018,7 @@
         <w:t xml:space="preserve"> cGAN-v2 </w:t>
       </w:r>
       <w:r>
-        <w:t>后，生成</w:t>
-      </w:r>
-      <w:r>
-        <w:t>分布明显改善；继续训练到</w:t>
+        <w:t>后，生成分布明显改善；继续训练到</w:t>
       </w:r>
       <w:r>
         <w:t xml:space="preserve"> 40 </w:t>
@@ -6841,7 +7060,10 @@
         <w:t>”</w:t>
       </w:r>
       <w:r>
-        <w:t>，还应同时说明生成质量、筛选策略、增强比例和下游验证设置。</w:t>
+        <w:t>，还应同时说明生成质量、筛选策略、增强比例和下游验证</w:t>
+      </w:r>
+      <w:r>
+        <w:t>设置。</w:t>
       </w:r>
     </w:p>
     <w:p>
@@ -6909,7 +7131,10 @@
         <w:jc w:val="both"/>
       </w:pPr>
       <w:r>
-        <w:t>工业就绪度分析进一步说明，单一准确率不足以支撑上线判断。</w:t>
+        <w:t>工业就绪度分析进一步说明，</w:t>
+      </w:r>
+      <w:r>
+        <w:t>单一准确率不足以支撑上线判断。</w:t>
       </w:r>
       <w:r>
         <w:t xml:space="preserve">300 </w:t>
@@ -6964,7 +7189,10 @@
         <w:t>和</w:t>
       </w:r>
       <w:r>
-        <w:t xml:space="preserve"> MobileNetV3-Small </w:t>
+        <w:t xml:space="preserve"> MobileNetV</w:t>
+      </w:r>
+      <w:r>
+        <w:t xml:space="preserve">3-Small </w:t>
       </w:r>
       <w:r>
         <w:t>在默认参数下低于</w:t>
@@ -6973,7 +7201,11 @@
         <w:t xml:space="preserve"> small CNN</w:t>
       </w:r>
       <w:r>
-        <w:t>，说明模型选择要结合数据规模、输入分辨率和训练策略。对于答辩而言，这一结果反而增强了实验可信度，因为本文没有只保留有利结果，而是记录了扩展模型在当前设置下的不足，并给出后续调参方向。</w:t>
+        <w:t>，说明</w:t>
+      </w:r>
+      <w:r>
+        <w:lastRenderedPageBreak/>
+        <w:t>模型选择要结合数据规模、输入分辨率和训练策略。对于答辩而言，这一结果反而增强了实验可信度，因为本文没有只保留有利结果，而是记录了扩展模型在当前设置下的不足，并给出后续调参方向。</w:t>
       </w:r>
     </w:p>
     <w:p>
@@ -6987,7 +7219,7 @@
         <w:spacing w:before="240" w:after="240"/>
         <w:jc w:val="center"/>
       </w:pPr>
-      <w:bookmarkStart w:id="30" w:name="_Toc229235103"/>
+      <w:bookmarkStart w:id="30" w:name="_Toc229254590"/>
       <w:r>
         <w:rPr>
           <w:rFonts w:ascii="Times New Roman" w:eastAsia="黑体" w:hAnsi="Times New Roman"/>
@@ -7034,7 +7266,10 @@
         <w:t>README</w:t>
       </w:r>
       <w:r>
-        <w:t>、答辩文档、核心证据图、比例消融结果、多种子结果、工业就绪度</w:t>
+        <w:t>、答辩文档、核心证据图、比例消融结果、多种</w:t>
+      </w:r>
+      <w:r>
+        <w:t>子结果、工业就绪度</w:t>
       </w:r>
       <w:r>
         <w:t xml:space="preserve"> JSON</w:t>
@@ -7088,10 +7323,7 @@
         <w:t xml:space="preserve">Git </w:t>
       </w:r>
       <w:r>
-        <w:t>提交和关键路径，便</w:t>
-      </w:r>
-      <w:r>
-        <w:t>于答辩前或他人复现实验。</w:t>
+        <w:t>提交和关键路径，便于答辩前或他人复现实验。</w:t>
       </w:r>
     </w:p>
     <w:p>
@@ -7107,13 +7339,85 @@
         <w:t xml:space="preserve">Streamlit </w:t>
       </w:r>
       <w:r>
-        <w:t>首页可正常访问，侧边栏能够切换各功能模块。答辩材料与健康检查模块可以集中展示关键路径、文档和证据图，减少现场查找文件的风险。分类验证模块能够导出低置信度样本，便于人工复核；目标检测模块能够完成小样本训练和</w:t>
+        <w:t>首页可正常访问，侧边栏能够切换各功能模块。答辩材料与健康检查模块可以集中展示关键路径、文档和证据图，减少现场查找文件的风险。分类验证模块能够导出低置信度样本，便于人工复核；目标检测模块能够完</w:t>
+      </w:r>
+      <w:r>
+        <w:t>成小样本训练和</w:t>
       </w:r>
       <w:r>
         <w:t xml:space="preserve"> AP50 </w:t>
       </w:r>
       <w:r>
         <w:t>输出。经过这些测试后，系统已经具备从算法实验到答辩展示的基本完整性。</w:t>
+      </w:r>
+    </w:p>
+    <w:p>
+      <w:pPr>
+        <w:jc w:val="center"/>
+      </w:pPr>
+      <w:r>
+        <w:rPr>
+          <w:noProof/>
+        </w:rPr>
+        <w:drawing>
+          <wp:inline distT="0" distB="0" distL="0" distR="0">
+            <wp:extent cx="5486400" cy="3731656"/>
+            <wp:effectExtent l="0" t="0" r="0" b="0"/>
+            <wp:docPr id="5" name="Picture 5"/>
+            <wp:cNvGraphicFramePr>
+              <a:graphicFrameLocks xmlns:a="http://schemas.openxmlformats.org/drawingml/2006/main" noChangeAspect="1"/>
+            </wp:cNvGraphicFramePr>
+            <a:graphic xmlns:a="http://schemas.openxmlformats.org/drawingml/2006/main">
+              <a:graphicData uri="http://schemas.openxmlformats.org/drawingml/2006/picture">
+                <pic:pic xmlns:pic="http://schemas.openxmlformats.org/drawingml/2006/picture">
+                  <pic:nvPicPr>
+                    <pic:cNvPr id="0" name="system_workflow_industrial.png"/>
+                    <pic:cNvPicPr/>
+                  </pic:nvPicPr>
+                  <pic:blipFill>
+                    <a:blip r:embed="rId12"/>
+                    <a:stretch>
+                      <a:fillRect/>
+                    </a:stretch>
+                  </pic:blipFill>
+                  <pic:spPr>
+                    <a:xfrm>
+                      <a:off x="0" y="0"/>
+                      <a:ext cx="5486400" cy="3731656"/>
+                    </a:xfrm>
+                    <a:prstGeom prst="rect">
+                      <a:avLst/>
+                    </a:prstGeom>
+                  </pic:spPr>
+                </pic:pic>
+              </a:graphicData>
+            </a:graphic>
+          </wp:inline>
+        </w:drawing>
+      </w:r>
+    </w:p>
+    <w:p>
+      <w:pPr>
+        <w:spacing w:after="120"/>
+        <w:jc w:val="center"/>
+      </w:pPr>
+      <w:r>
+        <w:rPr>
+          <w:sz w:val="21"/>
+        </w:rPr>
+        <w:t>图</w:t>
+      </w:r>
+      <w:r>
+        <w:rPr>
+          <w:sz w:val="21"/>
+        </w:rPr>
+        <w:t xml:space="preserve"> 5 </w:t>
+      </w:r>
+      <w:r>
+        <w:rPr>
+          <w:sz w:val="21"/>
+        </w:rPr>
+        <w:t>工业缺陷数据增强系统闭环流程</w:t>
       </w:r>
     </w:p>
     <w:p>
@@ -7123,16 +7427,60 @@
         <w:jc w:val="both"/>
       </w:pPr>
       <w:r>
-        <w:t>从工程交付角度看，本系统还特别关注实验留痕。每次关键实验均尽量保存参数、结果表、</w:t>
+        <w:t>系统闭环流程图概括了从</w:t>
+      </w:r>
+      <w:r>
+        <w:t xml:space="preserve"> NEU-DET </w:t>
+      </w:r>
+      <w:r>
+        <w:t>原始图像和</w:t>
+      </w:r>
+      <w:r>
+        <w:t xml:space="preserve"> XML </w:t>
+      </w:r>
+      <w:r>
+        <w:t>标注出发，到</w:t>
+      </w:r>
+      <w:r>
+        <w:t xml:space="preserve"> ROI </w:t>
+      </w:r>
+      <w:r>
+        <w:t>预处理、传统增强或</w:t>
+      </w:r>
+      <w:r>
+        <w:t xml:space="preserve"> cGAN-v2 </w:t>
+      </w:r>
+      <w:r>
+        <w:t>生成、质量评估、样本筛选、下游分类验证、工业门槛</w:t>
+      </w:r>
+      <w:r>
+        <w:lastRenderedPageBreak/>
+        <w:t>判断和答辩材料生成的完整流程。该图适合作为论文系统设计章节或答辩总结页的总览图，用于说明本课题并非只训练一个</w:t>
+      </w:r>
+      <w:r>
+        <w:t xml:space="preserve"> GAN </w:t>
+      </w:r>
+      <w:r>
+        <w:t>模型，而是围绕工业缺陷样本增强建立了可复验的实验链路。</w:t>
+      </w:r>
+    </w:p>
+    <w:p>
+      <w:pPr>
+        <w:spacing w:after="0" w:line="360" w:lineRule="auto"/>
+        <w:ind w:firstLine="480"/>
+        <w:jc w:val="both"/>
+      </w:pPr>
+      <w:r>
+        <w:t>从工程交付角度看，本系统还特别关注</w:t>
+      </w:r>
+      <w:r>
+        <w:t>实验留痕。每次关键实验均尽量保存参数、结果表、</w:t>
       </w:r>
       <w:r>
         <w:t xml:space="preserve">JSON </w:t>
       </w:r>
       <w:r>
-        <w:t>摘要和图像证据，而不是只在终端中观察一次结果。这样做的好处是，答辩时可以</w:t>
-      </w:r>
-      <w:r>
-        <w:t>直接追溯</w:t>
+        <w:t>摘要和图像证据，而不是只在终端中观察一次结果。这样做的好处是，答辩时可以直接追溯</w:t>
       </w:r>
       <w:r>
         <w:t>“</w:t>
@@ -7158,7 +7506,7 @@
         <w:spacing w:before="240" w:after="240"/>
         <w:jc w:val="center"/>
       </w:pPr>
-      <w:bookmarkStart w:id="31" w:name="_Toc229235104"/>
+      <w:bookmarkStart w:id="31" w:name="_Toc229254591"/>
       <w:r>
         <w:rPr>
           <w:rFonts w:ascii="Times New Roman" w:eastAsia="黑体" w:hAnsi="Times New Roman"/>
@@ -7193,7 +7541,10 @@
         <w:t xml:space="preserve"> 600 </w:t>
       </w:r>
       <w:r>
-        <w:t>张方案下取得了较好分类结果，但纹理多样性还可以继续提高，以减少同类样本过于相似的问题。比例消融目前主要在</w:t>
+        <w:t>张方案下取得了较好分类结果，但纹理多样性还可以继续提高，</w:t>
+      </w:r>
+      <w:r>
+        <w:t>以减少同类样本过于相似的问题。比例消融目前主要在</w:t>
       </w:r>
       <w:r>
         <w:t xml:space="preserve"> seed 42 </w:t>
@@ -7205,10 +7556,7 @@
         <w:t xml:space="preserve">600 </w:t>
       </w:r>
       <w:r>
-        <w:t>张方案虽然已做多随机种子复验，但更完整的实验应</w:t>
-      </w:r>
-      <w:r>
-        <w:t>对每个比例都进行多种子统计。目标检测验证入口已经补充，不过</w:t>
+        <w:t>张方案虽然已做多随机种子复验，但更完整的实验应对每个比例都进行多种子统计。目标检测验证入口已经补充，不过</w:t>
       </w:r>
       <w:r>
         <w:t xml:space="preserve"> GAN </w:t>
@@ -7263,7 +7611,10 @@
         <w:t>未来工作可以从三方面展开。模型方面，可尝试</w:t>
       </w:r>
       <w:r>
-        <w:t xml:space="preserve"> ACGAN</w:t>
+        <w:t xml:space="preserve"> ACGA</w:t>
+      </w:r>
+      <w:r>
+        <w:t>N</w:t>
       </w:r>
       <w:r>
         <w:t>、</w:t>
@@ -7287,10 +7638,7 @@
         <w:t>增强和混合增强在检测</w:t>
       </w:r>
       <w:r>
-        <w:t xml:space="preserve"> m</w:t>
-      </w:r>
-      <w:r>
-        <w:t xml:space="preserve">AP </w:t>
+        <w:t xml:space="preserve"> mAP </w:t>
       </w:r>
       <w:r>
         <w:t>上的对照；系统方面，可加入任务队列、显存监控、</w:t>
@@ -7319,7 +7667,7 @@
         <w:spacing w:before="240" w:after="240"/>
         <w:jc w:val="center"/>
       </w:pPr>
-      <w:bookmarkStart w:id="32" w:name="_Toc229235105"/>
+      <w:bookmarkStart w:id="32" w:name="_Toc229254592"/>
       <w:r>
         <w:rPr>
           <w:rFonts w:ascii="Times New Roman" w:eastAsia="黑体" w:hAnsi="Times New Roman"/>
@@ -7366,16 +7714,16 @@
         <w:t xml:space="preserve">cGAN </w:t>
       </w:r>
       <w:r>
-        <w:t>生成、质量评估、样本筛选、下游验证到工业就绪度分析的闭环。实验表明，</w:t>
+        <w:t>生成、质量评估、</w:t>
+      </w:r>
+      <w:r>
+        <w:t>样本筛选、下游验证到工业就绪度分析的闭环。实验表明，</w:t>
       </w:r>
       <w:r>
         <w:t xml:space="preserve">cGAN-v2 40 </w:t>
       </w:r>
       <w:r>
-        <w:t>轮结合质量筛选和合适生成比例后，可以有效提升下游分类性</w:t>
-      </w:r>
-      <w:r>
-        <w:t>能。每类</w:t>
+        <w:t>轮结合质量筛选和合适生成比例后，可以有效提升下游分类性能。每类</w:t>
       </w:r>
       <w:r>
         <w:t xml:space="preserve"> 100 </w:t>
@@ -7433,10 +7781,10 @@
         <w:t xml:space="preserve"> GAN </w:t>
       </w:r>
       <w:r>
-        <w:t>增强保持了相对谨慎的判断：它并非在任何设置下都优于传统增强，实际收益取决于生成质量、样本筛选、加入比例和训练策略。论文通过质量指标、比例消融、多随机种子、类别召回率和低置信度样本分析，对这一判断进行了验证。系统将上述环节整合为可运行、可展示、可复验的软件平台，为工业缺陷检测数据扩充和毕业</w:t>
-      </w:r>
-      <w:r>
-        <w:t>设计答辩提供了较完整的支撑。</w:t>
+        <w:t>增强保持了相对谨慎的判断：它并非在任何设置下都优于传统增强，实际收益取决于生成质量、样本筛选、加入比例和训练策略。论文通过质量指标、比例消融、多随机种子、类别召</w:t>
+      </w:r>
+      <w:r>
+        <w:t>回率和低置信度样本分析，对这一判断进行了验证。系统将上述环节整合为可运行、可展示、可复验的软件平台，为工业缺陷检测数据扩充和毕业设计答辩提供了较完整的支撑。</w:t>
       </w:r>
     </w:p>
     <w:p>
@@ -7450,7 +7798,7 @@
         <w:spacing w:before="240" w:after="240"/>
         <w:jc w:val="center"/>
       </w:pPr>
-      <w:bookmarkStart w:id="33" w:name="_Toc229235106"/>
+      <w:bookmarkStart w:id="33" w:name="_Toc229254593"/>
       <w:r>
         <w:rPr>
           <w:rFonts w:ascii="Times New Roman" w:eastAsia="黑体" w:hAnsi="Times New Roman"/>
@@ -7475,10 +7823,10 @@
         <w:jc w:val="both"/>
       </w:pPr>
       <w:r>
-        <w:t>[2] Mirza M., Osindero S. Conditional Generative Adversarial Nets. arXiv preprint arXiv:1411.1</w:t>
-      </w:r>
-      <w:r>
-        <w:t>784, 2014.</w:t>
+        <w:t xml:space="preserve">[2] Mirza M., Osindero S. </w:t>
+      </w:r>
+      <w:r>
+        <w:t>Conditional Generative Adversarial Nets. arXiv preprint arXiv:1411.1784, 2014.</w:t>
       </w:r>
     </w:p>
     <w:p>
@@ -7496,7 +7844,10 @@
         <w:jc w:val="both"/>
       </w:pPr>
       <w:r>
-        <w:t>[4] Mao X., Li Q., Xie H., et al. Least Squares Generative Adversarial Networks. ICCV, 2017.</w:t>
+        <w:t xml:space="preserve">[4] Mao X., Li Q., Xie H., et al. </w:t>
+      </w:r>
+      <w:r>
+        <w:t>Least Squares Generative Adversarial Networks. ICCV, 2017.</w:t>
       </w:r>
     </w:p>
     <w:p>
@@ -7505,10 +7856,7 @@
         <w:jc w:val="both"/>
       </w:pPr>
       <w:r>
-        <w:t>[5] Miyat</w:t>
-      </w:r>
-      <w:r>
-        <w:t>o T., Kataoka T., Koyama M., Yoshida Y. Spectral Normalization for Generative Adversarial Networks. ICLR, 2018.</w:t>
+        <w:t>[5] Miyato T., Kataoka T., Koyama M., Yoshida Y. Spectral Normalization for Generative Adversarial Networks. ICLR, 2018.</w:t>
       </w:r>
     </w:p>
     <w:p>
@@ -7517,7 +7865,10 @@
         <w:jc w:val="both"/>
       </w:pPr>
       <w:r>
-        <w:t>[6] He K., Zhang X., Ren S., Sun J. Deep Residual Learning for Image Recognition. CVPR, 2016.</w:t>
+        <w:t>[6] He K., Zhang X., Ren S., Sun J. Deep Residual Learning for Image Recogni</w:t>
+      </w:r>
+      <w:r>
+        <w:t>tion. CVPR, 2016.</w:t>
       </w:r>
     </w:p>
     <w:p>
@@ -7526,10 +7877,7 @@
         <w:jc w:val="both"/>
       </w:pPr>
       <w:r>
-        <w:t>[7] Wang Z., Bovik A. C., Sheikh H. R., Simoncelli</w:t>
-      </w:r>
-      <w:r>
-        <w:t xml:space="preserve"> E. P. Image Quality Assessment: From Error Visibility to Structural Similarity. IEEE Transactions on Image Processing, 2004.</w:t>
+        <w:t>[7] Wang Z., Bovik A. C., Sheikh H. R., Simoncelli E. P. Image Quality Assessment: From Error Visibility to Structural Similarity. IEEE Transactions on Image Processing, 2004.</w:t>
       </w:r>
     </w:p>
     <w:p>
@@ -7538,10 +7886,10 @@
         <w:jc w:val="both"/>
       </w:pPr>
       <w:r>
-        <w:t xml:space="preserve">[8] Heusel M., Ramsauer H., Unterthiner T., Nessler B., Hochreiter S. GANs Trained by a Two Time-Scale Update Rule Converge to a </w:t>
-      </w:r>
-      <w:r>
-        <w:t>Local Nash Equilibrium. NeurIPS, 2017.</w:t>
+        <w:t>[8] Heusel M., Ramsauer H., Unterthiner T., Nessler B., Hochre</w:t>
+      </w:r>
+      <w:r>
+        <w:t>iter S. GANs Trained by a Two Time-Scale Update Rule Converge to a Local Nash Equilibrium. NeurIPS, 2017.</w:t>
       </w:r>
     </w:p>
     <w:p>
@@ -7550,7 +7898,10 @@
         <w:jc w:val="both"/>
       </w:pPr>
       <w:r>
-        <w:t>[9] Song K., Yan Y. A Noise Robust Method Based on Completed Local Binary Patterns for Hot-Rolled Steel Strip Surface Defects. Applied Surface Science, 2013.</w:t>
+        <w:t>[9] Song K., Yan Y. A Noise Robust Method Based on Completed Local Binary Patterns for Hot-Rolled Steel Strip Surface Defects. Applied Surface Science</w:t>
+      </w:r>
+      <w:r>
+        <w:t>, 2013.</w:t>
       </w:r>
     </w:p>
     <w:p>
@@ -7559,10 +7910,7 @@
         <w:jc w:val="both"/>
       </w:pPr>
       <w:r>
-        <w:t>[10] Ren S., He K., Girshick R., Sun J. Faster R-CNN: Towar</w:t>
-      </w:r>
-      <w:r>
-        <w:t>ds Real-Time Object Detection with Region Proposal Networks. NeurIPS, 2015.</w:t>
+        <w:t>[10] Ren S., He K., Girshick R., Sun J. Faster R-CNN: Towards Real-Time Object Detection with Region Proposal Networks. NeurIPS, 2015.</w:t>
       </w:r>
     </w:p>
     <w:p>
@@ -7580,10 +7928,10 @@
         <w:jc w:val="both"/>
       </w:pPr>
       <w:r>
-        <w:t>[12] Howard A., Sandler M., Chu G., et al. Searching for MobileNetV3. ICCV, 20</w:t>
-      </w:r>
-      <w:r>
-        <w:t>19.</w:t>
+        <w:t>[12] Howard</w:t>
+      </w:r>
+      <w:r>
+        <w:t xml:space="preserve"> A., Sandler M., Chu G., et al. Searching for MobileNetV3. ICCV, 2019.</w:t>
       </w:r>
     </w:p>
     <w:p>
@@ -7597,7 +7945,7 @@
         <w:spacing w:before="240" w:after="240"/>
         <w:jc w:val="center"/>
       </w:pPr>
-      <w:bookmarkStart w:id="34" w:name="_Toc229235107"/>
+      <w:bookmarkStart w:id="34" w:name="_Toc229254594"/>
       <w:r>
         <w:rPr>
           <w:rFonts w:ascii="Times New Roman" w:eastAsia="黑体" w:hAnsi="Times New Roman"/>
@@ -7666,7 +8014,7 @@
       </w:r>
     </w:p>
     <w:sectPr>
-      <w:footerReference w:type="default" r:id="rId11"/>
+      <w:footerReference w:type="default" r:id="rId13"/>
       <w:pgSz w:w="11906" w:h="16838"/>
       <w:pgMar w:top="1440" w:right="1474" w:bottom="1440" w:left="1701" w:header="720" w:footer="720" w:gutter="0"/>
       <w:pgNumType w:start="1"/>
@@ -19363,7 +19711,7 @@
     <w:autoRedefine/>
     <w:uiPriority w:val="39"/>
     <w:unhideWhenUsed/>
-    <w:rsid w:val="00AE5876"/>
+    <w:rsid w:val="0084479B"/>
   </w:style>
   <w:style w:type="paragraph" w:styleId="TOC2">
     <w:name w:val="toc 2"/>
@@ -19372,7 +19720,7 @@
     <w:autoRedefine/>
     <w:uiPriority w:val="39"/>
     <w:unhideWhenUsed/>
-    <w:rsid w:val="00AE5876"/>
+    <w:rsid w:val="0084479B"/>
     <w:pPr>
       <w:ind w:leftChars="200" w:left="420"/>
     </w:pPr>
@@ -19382,7 +19730,7 @@
     <w:basedOn w:val="a2"/>
     <w:uiPriority w:val="99"/>
     <w:unhideWhenUsed/>
-    <w:rsid w:val="00AE5876"/>
+    <w:rsid w:val="0084479B"/>
     <w:rPr>
       <w:color w:val="0000FF" w:themeColor="hyperlink"/>
       <w:u w:val="single"/>
@@ -19716,7 +20064,7 @@
 </file>
 
 <file path=customXml/itemProps1.xml><?xml version="1.0" encoding="utf-8"?>
-<ds:datastoreItem xmlns:ds="http://schemas.openxmlformats.org/officeDocument/2006/customXml" ds:itemID="{AD92BEDC-11A4-45B4-83A5-02B34CF1ECD8}">
+<ds:datastoreItem xmlns:ds="http://schemas.openxmlformats.org/officeDocument/2006/customXml" ds:itemID="{C15B9BED-CE54-4407-A21D-DF2D337F8FCB}">
   <ds:schemaRefs>
     <ds:schemaRef ds:uri="http://schemas.openxmlformats.org/officeDocument/2006/bibliography"/>
   </ds:schemaRefs>

</xml_diff>

<commit_message>
feat: add quality-selected GAN export preview
</commit_message>
<xml_diff>
--- a/毕业论文_初稿_格式化.docx
+++ b/毕业论文_初稿_格式化.docx
@@ -159,7 +159,7 @@
         <w:spacing w:before="240" w:after="240"/>
         <w:jc w:val="center"/>
       </w:pPr>
-      <w:bookmarkStart w:id="1" w:name="_Toc229254561"/>
+      <w:bookmarkStart w:id="1" w:name="_Toc229255498"/>
       <w:r>
         <w:rPr>
           <w:rFonts w:ascii="Times New Roman" w:eastAsia="黑体" w:hAnsi="Times New Roman"/>
@@ -448,7 +448,7 @@
         <w:spacing w:before="240" w:after="240"/>
         <w:jc w:val="center"/>
       </w:pPr>
-      <w:bookmarkStart w:id="2" w:name="_Toc229254562"/>
+      <w:bookmarkStart w:id="2" w:name="_Toc229255499"/>
       <w:r>
         <w:rPr>
           <w:rFonts w:ascii="Times New Roman" w:eastAsia="黑体" w:hAnsi="Times New Roman"/>
@@ -586,7 +586,7 @@
       <w:r>
         <w:fldChar w:fldCharType="separate"/>
       </w:r>
-      <w:hyperlink w:anchor="_Toc229254561" w:history="1">
+      <w:hyperlink w:anchor="_Toc229255498" w:history="1">
         <w:r>
           <w:rPr>
             <w:rStyle w:val="aff9"/>
@@ -614,7 +614,7 @@
             <w:noProof/>
             <w:webHidden/>
           </w:rPr>
-          <w:instrText xml:space="preserve"> PAGEREF _Toc229254561 \h </w:instrText>
+          <w:instrText xml:space="preserve"> PAGEREF _Toc229255498 \h </w:instrText>
         </w:r>
         <w:r>
           <w:rPr>
@@ -655,7 +655,7 @@
           <w:noProof/>
         </w:rPr>
       </w:pPr>
-      <w:hyperlink w:anchor="_Toc229254562" w:history="1">
+      <w:hyperlink w:anchor="_Toc229255499" w:history="1">
         <w:r>
           <w:rPr>
             <w:rStyle w:val="aff9"/>
@@ -683,7 +683,7 @@
             <w:noProof/>
             <w:webHidden/>
           </w:rPr>
-          <w:instrText xml:space="preserve"> PAGEREF _Toc229254562 \h </w:instrText>
+          <w:instrText xml:space="preserve"> PAGEREF _Toc229255499 \h </w:instrText>
         </w:r>
         <w:r>
           <w:rPr>
@@ -724,7 +724,7 @@
           <w:noProof/>
         </w:rPr>
       </w:pPr>
-      <w:hyperlink w:anchor="_Toc229254563" w:history="1">
+      <w:hyperlink w:anchor="_Toc229255500" w:history="1">
         <w:r>
           <w:rPr>
             <w:rStyle w:val="aff9"/>
@@ -768,7 +768,7 @@
             <w:noProof/>
             <w:webHidden/>
           </w:rPr>
-          <w:instrText xml:space="preserve"> PAGEREF _Toc229254563 \h </w:instrText>
+          <w:instrText xml:space="preserve"> PAGEREF _Toc229255500 \h </w:instrText>
         </w:r>
         <w:r>
           <w:rPr>
@@ -810,7 +810,7 @@
           <w:noProof/>
         </w:rPr>
       </w:pPr>
-      <w:hyperlink w:anchor="_Toc229254564" w:history="1">
+      <w:hyperlink w:anchor="_Toc229255501" w:history="1">
         <w:r>
           <w:rPr>
             <w:rStyle w:val="aff9"/>
@@ -846,7 +846,7 @@
             <w:noProof/>
             <w:webHidden/>
           </w:rPr>
-          <w:instrText xml:space="preserve"> PAGEREF _Toc229254564 \h </w:instrText>
+          <w:instrText xml:space="preserve"> PAGEREF _Toc229255501 \h </w:instrText>
         </w:r>
         <w:r>
           <w:rPr>
@@ -888,7 +888,7 @@
           <w:noProof/>
         </w:rPr>
       </w:pPr>
-      <w:hyperlink w:anchor="_Toc229254565" w:history="1">
+      <w:hyperlink w:anchor="_Toc229255502" w:history="1">
         <w:r>
           <w:rPr>
             <w:rStyle w:val="aff9"/>
@@ -924,7 +924,7 @@
             <w:noProof/>
             <w:webHidden/>
           </w:rPr>
-          <w:instrText xml:space="preserve"> PAGEREF _Toc229254565 \h </w:instrText>
+          <w:instrText xml:space="preserve"> PAGEREF _Toc229255502 \h </w:instrText>
         </w:r>
         <w:r>
           <w:rPr>
@@ -966,7 +966,7 @@
           <w:noProof/>
         </w:rPr>
       </w:pPr>
-      <w:hyperlink w:anchor="_Toc229254566" w:history="1">
+      <w:hyperlink w:anchor="_Toc229255503" w:history="1">
         <w:r>
           <w:rPr>
             <w:rStyle w:val="aff9"/>
@@ -1002,7 +1002,7 @@
             <w:noProof/>
             <w:webHidden/>
           </w:rPr>
-          <w:instrText xml:space="preserve"> PAGEREF _Toc229254566 \h </w:instrText>
+          <w:instrText xml:space="preserve"> PAGEREF _Toc229255503 \h </w:instrText>
         </w:r>
         <w:r>
           <w:rPr>
@@ -1044,7 +1044,7 @@
           <w:noProof/>
         </w:rPr>
       </w:pPr>
-      <w:hyperlink w:anchor="_Toc229254567" w:history="1">
+      <w:hyperlink w:anchor="_Toc229255504" w:history="1">
         <w:r>
           <w:rPr>
             <w:rStyle w:val="aff9"/>
@@ -1080,7 +1080,7 @@
             <w:noProof/>
             <w:webHidden/>
           </w:rPr>
-          <w:instrText xml:space="preserve"> PAGEREF _Toc229254567 \h </w:instrText>
+          <w:instrText xml:space="preserve"> PAGEREF _Toc229255504 \h </w:instrText>
         </w:r>
         <w:r>
           <w:rPr>
@@ -1121,7 +1121,7 @@
           <w:noProof/>
         </w:rPr>
       </w:pPr>
-      <w:hyperlink w:anchor="_Toc229254568" w:history="1">
+      <w:hyperlink w:anchor="_Toc229255505" w:history="1">
         <w:r>
           <w:rPr>
             <w:rStyle w:val="aff9"/>
@@ -1165,7 +1165,7 @@
             <w:noProof/>
             <w:webHidden/>
           </w:rPr>
-          <w:instrText xml:space="preserve"> PAGEREF _Toc229254568 \h </w:instrText>
+          <w:instrText xml:space="preserve"> PAGEREF _Toc229255505 \h </w:instrText>
         </w:r>
         <w:r>
           <w:rPr>
@@ -1207,7 +1207,7 @@
           <w:noProof/>
         </w:rPr>
       </w:pPr>
-      <w:hyperlink w:anchor="_Toc229254569" w:history="1">
+      <w:hyperlink w:anchor="_Toc229255506" w:history="1">
         <w:r>
           <w:rPr>
             <w:rStyle w:val="aff9"/>
@@ -1243,7 +1243,7 @@
             <w:noProof/>
             <w:webHidden/>
           </w:rPr>
-          <w:instrText xml:space="preserve"> PAGEREF _Toc229254569 \h </w:instrText>
+          <w:instrText xml:space="preserve"> PAGEREF _Toc229255506 \h </w:instrText>
         </w:r>
         <w:r>
           <w:rPr>
@@ -1285,7 +1285,7 @@
           <w:noProof/>
         </w:rPr>
       </w:pPr>
-      <w:hyperlink w:anchor="_Toc229254570" w:history="1">
+      <w:hyperlink w:anchor="_Toc229255507" w:history="1">
         <w:r>
           <w:rPr>
             <w:rStyle w:val="aff9"/>
@@ -1321,7 +1321,7 @@
             <w:noProof/>
             <w:webHidden/>
           </w:rPr>
-          <w:instrText xml:space="preserve"> PAGEREF _Toc229254570 \h </w:instrText>
+          <w:instrText xml:space="preserve"> PAGEREF _Toc229255507 \h </w:instrText>
         </w:r>
         <w:r>
           <w:rPr>
@@ -1363,7 +1363,7 @@
           <w:noProof/>
         </w:rPr>
       </w:pPr>
-      <w:hyperlink w:anchor="_Toc229254571" w:history="1">
+      <w:hyperlink w:anchor="_Toc229255508" w:history="1">
         <w:r>
           <w:rPr>
             <w:rStyle w:val="aff9"/>
@@ -1399,7 +1399,7 @@
             <w:noProof/>
             <w:webHidden/>
           </w:rPr>
-          <w:instrText xml:space="preserve"> PAGEREF _Toc229254571 \h </w:instrText>
+          <w:instrText xml:space="preserve"> PAGEREF _Toc229255508 \h </w:instrText>
         </w:r>
         <w:r>
           <w:rPr>
@@ -1440,7 +1440,7 @@
           <w:noProof/>
         </w:rPr>
       </w:pPr>
-      <w:hyperlink w:anchor="_Toc229254572" w:history="1">
+      <w:hyperlink w:anchor="_Toc229255509" w:history="1">
         <w:r>
           <w:rPr>
             <w:rStyle w:val="aff9"/>
@@ -1484,7 +1484,7 @@
             <w:noProof/>
             <w:webHidden/>
           </w:rPr>
-          <w:instrText xml:space="preserve"> PAGEREF _Toc229254572 \h </w:instrText>
+          <w:instrText xml:space="preserve"> PAGEREF _Toc229255509 \h </w:instrText>
         </w:r>
         <w:r>
           <w:rPr>
@@ -1526,7 +1526,7 @@
           <w:noProof/>
         </w:rPr>
       </w:pPr>
-      <w:hyperlink w:anchor="_Toc229254573" w:history="1">
+      <w:hyperlink w:anchor="_Toc229255510" w:history="1">
         <w:r>
           <w:rPr>
             <w:rStyle w:val="aff9"/>
@@ -1562,7 +1562,7 @@
             <w:noProof/>
             <w:webHidden/>
           </w:rPr>
-          <w:instrText xml:space="preserve"> PAGEREF _Toc229254573 \h </w:instrText>
+          <w:instrText xml:space="preserve"> PAGEREF _Toc229255510 \h </w:instrText>
         </w:r>
         <w:r>
           <w:rPr>
@@ -1604,7 +1604,7 @@
           <w:noProof/>
         </w:rPr>
       </w:pPr>
-      <w:hyperlink w:anchor="_Toc229254574" w:history="1">
+      <w:hyperlink w:anchor="_Toc229255511" w:history="1">
         <w:r>
           <w:rPr>
             <w:rStyle w:val="aff9"/>
@@ -1640,7 +1640,7 @@
             <w:noProof/>
             <w:webHidden/>
           </w:rPr>
-          <w:instrText xml:space="preserve"> PAGEREF _Toc229254574 \h </w:instrText>
+          <w:instrText xml:space="preserve"> PAGEREF _Toc229255511 \h </w:instrText>
         </w:r>
         <w:r>
           <w:rPr>
@@ -1682,7 +1682,7 @@
           <w:noProof/>
         </w:rPr>
       </w:pPr>
-      <w:hyperlink w:anchor="_Toc229254575" w:history="1">
+      <w:hyperlink w:anchor="_Toc229255512" w:history="1">
         <w:r>
           <w:rPr>
             <w:rStyle w:val="aff9"/>
@@ -1718,7 +1718,7 @@
             <w:noProof/>
             <w:webHidden/>
           </w:rPr>
-          <w:instrText xml:space="preserve"> PAGEREF _Toc229254575 \h </w:instrText>
+          <w:instrText xml:space="preserve"> PAGEREF _Toc229255512 \h </w:instrText>
         </w:r>
         <w:r>
           <w:rPr>
@@ -1760,7 +1760,7 @@
           <w:noProof/>
         </w:rPr>
       </w:pPr>
-      <w:hyperlink w:anchor="_Toc229254576" w:history="1">
+      <w:hyperlink w:anchor="_Toc229255513" w:history="1">
         <w:r>
           <w:rPr>
             <w:rStyle w:val="aff9"/>
@@ -1796,7 +1796,7 @@
             <w:noProof/>
             <w:webHidden/>
           </w:rPr>
-          <w:instrText xml:space="preserve"> PAGEREF _Toc229254576 \h </w:instrText>
+          <w:instrText xml:space="preserve"> PAGEREF _Toc229255513 \h </w:instrText>
         </w:r>
         <w:r>
           <w:rPr>
@@ -1837,7 +1837,7 @@
           <w:noProof/>
         </w:rPr>
       </w:pPr>
-      <w:hyperlink w:anchor="_Toc229254577" w:history="1">
+      <w:hyperlink w:anchor="_Toc229255514" w:history="1">
         <w:r>
           <w:rPr>
             <w:rStyle w:val="aff9"/>
@@ -1881,7 +1881,7 @@
             <w:noProof/>
             <w:webHidden/>
           </w:rPr>
-          <w:instrText xml:space="preserve"> PAGEREF _Toc229254577 \h </w:instrText>
+          <w:instrText xml:space="preserve"> PAGEREF _Toc229255514 \h </w:instrText>
         </w:r>
         <w:r>
           <w:rPr>
@@ -1923,7 +1923,7 @@
           <w:noProof/>
         </w:rPr>
       </w:pPr>
-      <w:hyperlink w:anchor="_Toc229254578" w:history="1">
+      <w:hyperlink w:anchor="_Toc229255515" w:history="1">
         <w:r>
           <w:rPr>
             <w:rStyle w:val="aff9"/>
@@ -1959,7 +1959,7 @@
             <w:noProof/>
             <w:webHidden/>
           </w:rPr>
-          <w:instrText xml:space="preserve"> PAGEREF _Toc229254578 \h </w:instrText>
+          <w:instrText xml:space="preserve"> PAGEREF _Toc229255515 \h </w:instrText>
         </w:r>
         <w:r>
           <w:rPr>
@@ -2001,7 +2001,7 @@
           <w:noProof/>
         </w:rPr>
       </w:pPr>
-      <w:hyperlink w:anchor="_Toc229254579" w:history="1">
+      <w:hyperlink w:anchor="_Toc229255516" w:history="1">
         <w:r>
           <w:rPr>
             <w:rStyle w:val="aff9"/>
@@ -2037,7 +2037,7 @@
             <w:noProof/>
             <w:webHidden/>
           </w:rPr>
-          <w:instrText xml:space="preserve"> PAGEREF _Toc229254579 \h </w:instrText>
+          <w:instrText xml:space="preserve"> PAGEREF _Toc229255516 \h </w:instrText>
         </w:r>
         <w:r>
           <w:rPr>
@@ -2079,7 +2079,7 @@
           <w:noProof/>
         </w:rPr>
       </w:pPr>
-      <w:hyperlink w:anchor="_Toc229254580" w:history="1">
+      <w:hyperlink w:anchor="_Toc229255517" w:history="1">
         <w:r>
           <w:rPr>
             <w:rStyle w:val="aff9"/>
@@ -2115,7 +2115,7 @@
             <w:noProof/>
             <w:webHidden/>
           </w:rPr>
-          <w:instrText xml:space="preserve"> PAGEREF _Toc229254580 \h </w:instrText>
+          <w:instrText xml:space="preserve"> PAGEREF _Toc229255517 \h </w:instrText>
         </w:r>
         <w:r>
           <w:rPr>
@@ -2157,7 +2157,7 @@
           <w:noProof/>
         </w:rPr>
       </w:pPr>
-      <w:hyperlink w:anchor="_Toc229254581" w:history="1">
+      <w:hyperlink w:anchor="_Toc229255518" w:history="1">
         <w:r>
           <w:rPr>
             <w:rStyle w:val="aff9"/>
@@ -2193,7 +2193,7 @@
             <w:noProof/>
             <w:webHidden/>
           </w:rPr>
-          <w:instrText xml:space="preserve"> PAGEREF _Toc229254581 \h </w:instrText>
+          <w:instrText xml:space="preserve"> PAGEREF _Toc229255518 \h </w:instrText>
         </w:r>
         <w:r>
           <w:rPr>
@@ -2235,7 +2235,7 @@
           <w:noProof/>
         </w:rPr>
       </w:pPr>
-      <w:hyperlink w:anchor="_Toc229254582" w:history="1">
+      <w:hyperlink w:anchor="_Toc229255519" w:history="1">
         <w:r>
           <w:rPr>
             <w:rStyle w:val="aff9"/>
@@ -2271,7 +2271,7 @@
             <w:noProof/>
             <w:webHidden/>
           </w:rPr>
-          <w:instrText xml:space="preserve"> PAGEREF _Toc229254582 \h </w:instrText>
+          <w:instrText xml:space="preserve"> PAGEREF _Toc229255519 \h </w:instrText>
         </w:r>
         <w:r>
           <w:rPr>
@@ -2312,7 +2312,7 @@
           <w:noProof/>
         </w:rPr>
       </w:pPr>
-      <w:hyperlink w:anchor="_Toc229254583" w:history="1">
+      <w:hyperlink w:anchor="_Toc229255520" w:history="1">
         <w:r>
           <w:rPr>
             <w:rStyle w:val="aff9"/>
@@ -2356,7 +2356,7 @@
             <w:noProof/>
             <w:webHidden/>
           </w:rPr>
-          <w:instrText xml:space="preserve"> PAGEREF _Toc229254583 \h </w:instrText>
+          <w:instrText xml:space="preserve"> PAGEREF _Toc229255520 \h </w:instrText>
         </w:r>
         <w:r>
           <w:rPr>
@@ -2398,7 +2398,7 @@
           <w:noProof/>
         </w:rPr>
       </w:pPr>
-      <w:hyperlink w:anchor="_Toc229254584" w:history="1">
+      <w:hyperlink w:anchor="_Toc229255521" w:history="1">
         <w:r>
           <w:rPr>
             <w:rStyle w:val="aff9"/>
@@ -2434,7 +2434,7 @@
             <w:noProof/>
             <w:webHidden/>
           </w:rPr>
-          <w:instrText xml:space="preserve"> PAGEREF _Toc229254584 \h </w:instrText>
+          <w:instrText xml:space="preserve"> PAGEREF _Toc229255521 \h </w:instrText>
         </w:r>
         <w:r>
           <w:rPr>
@@ -2476,7 +2476,7 @@
           <w:noProof/>
         </w:rPr>
       </w:pPr>
-      <w:hyperlink w:anchor="_Toc229254585" w:history="1">
+      <w:hyperlink w:anchor="_Toc229255522" w:history="1">
         <w:r>
           <w:rPr>
             <w:rStyle w:val="aff9"/>
@@ -2512,7 +2512,7 @@
             <w:noProof/>
             <w:webHidden/>
           </w:rPr>
-          <w:instrText xml:space="preserve"> PAGEREF _Toc229254585 \h </w:instrText>
+          <w:instrText xml:space="preserve"> PAGEREF _Toc229255522 \h </w:instrText>
         </w:r>
         <w:r>
           <w:rPr>
@@ -2554,7 +2554,7 @@
           <w:noProof/>
         </w:rPr>
       </w:pPr>
-      <w:hyperlink w:anchor="_Toc229254586" w:history="1">
+      <w:hyperlink w:anchor="_Toc229255523" w:history="1">
         <w:r>
           <w:rPr>
             <w:rStyle w:val="aff9"/>
@@ -2590,7 +2590,7 @@
             <w:noProof/>
             <w:webHidden/>
           </w:rPr>
-          <w:instrText xml:space="preserve"> PAGEREF _Toc229254586 \h </w:instrText>
+          <w:instrText xml:space="preserve"> PAGEREF _Toc229255523 \h </w:instrText>
         </w:r>
         <w:r>
           <w:rPr>
@@ -2632,7 +2632,7 @@
           <w:noProof/>
         </w:rPr>
       </w:pPr>
-      <w:hyperlink w:anchor="_Toc229254587" w:history="1">
+      <w:hyperlink w:anchor="_Toc229255524" w:history="1">
         <w:r>
           <w:rPr>
             <w:rStyle w:val="aff9"/>
@@ -2668,7 +2668,7 @@
             <w:noProof/>
             <w:webHidden/>
           </w:rPr>
-          <w:instrText xml:space="preserve"> PAGEREF _Toc229254587 \h </w:instrText>
+          <w:instrText xml:space="preserve"> PAGEREF _Toc229255524 \h </w:instrText>
         </w:r>
         <w:r>
           <w:rPr>
@@ -2710,7 +2710,7 @@
           <w:noProof/>
         </w:rPr>
       </w:pPr>
-      <w:hyperlink w:anchor="_Toc229254588" w:history="1">
+      <w:hyperlink w:anchor="_Toc229255525" w:history="1">
         <w:r>
           <w:rPr>
             <w:rStyle w:val="aff9"/>
@@ -2746,7 +2746,7 @@
             <w:noProof/>
             <w:webHidden/>
           </w:rPr>
-          <w:instrText xml:space="preserve"> PAGEREF _Toc229254588 \h </w:instrText>
+          <w:instrText xml:space="preserve"> PAGEREF _Toc229255525 \h </w:instrText>
         </w:r>
         <w:r>
           <w:rPr>
@@ -2788,7 +2788,7 @@
           <w:noProof/>
         </w:rPr>
       </w:pPr>
-      <w:hyperlink w:anchor="_Toc229254589" w:history="1">
+      <w:hyperlink w:anchor="_Toc229255526" w:history="1">
         <w:r>
           <w:rPr>
             <w:rStyle w:val="aff9"/>
@@ -2824,7 +2824,7 @@
             <w:noProof/>
             <w:webHidden/>
           </w:rPr>
-          <w:instrText xml:space="preserve"> PAGEREF _Toc229254589 \h </w:instrText>
+          <w:instrText xml:space="preserve"> PAGEREF _Toc229255526 \h </w:instrText>
         </w:r>
         <w:r>
           <w:rPr>
@@ -2865,7 +2865,7 @@
           <w:noProof/>
         </w:rPr>
       </w:pPr>
-      <w:hyperlink w:anchor="_Toc229254590" w:history="1">
+      <w:hyperlink w:anchor="_Toc229255527" w:history="1">
         <w:r>
           <w:rPr>
             <w:rStyle w:val="aff9"/>
@@ -2909,7 +2909,7 @@
             <w:noProof/>
             <w:webHidden/>
           </w:rPr>
-          <w:instrText xml:space="preserve"> PAGEREF _Toc229254590 \h </w:instrText>
+          <w:instrText xml:space="preserve"> PAGEREF _Toc229255527 \h </w:instrText>
         </w:r>
         <w:r>
           <w:rPr>
@@ -2950,7 +2950,7 @@
           <w:noProof/>
         </w:rPr>
       </w:pPr>
-      <w:hyperlink w:anchor="_Toc229254591" w:history="1">
+      <w:hyperlink w:anchor="_Toc229255528" w:history="1">
         <w:r>
           <w:rPr>
             <w:rStyle w:val="aff9"/>
@@ -2994,7 +2994,7 @@
             <w:noProof/>
             <w:webHidden/>
           </w:rPr>
-          <w:instrText xml:space="preserve"> PAGEREF _Toc229254591 \h </w:instrText>
+          <w:instrText xml:space="preserve"> PAGEREF _Toc229255528 \h </w:instrText>
         </w:r>
         <w:r>
           <w:rPr>
@@ -3035,7 +3035,7 @@
           <w:noProof/>
         </w:rPr>
       </w:pPr>
-      <w:hyperlink w:anchor="_Toc229254592" w:history="1">
+      <w:hyperlink w:anchor="_Toc229255529" w:history="1">
         <w:r>
           <w:rPr>
             <w:rStyle w:val="aff9"/>
@@ -3079,7 +3079,7 @@
             <w:noProof/>
             <w:webHidden/>
           </w:rPr>
-          <w:instrText xml:space="preserve"> PAGEREF _Toc229254592 \h </w:instrText>
+          <w:instrText xml:space="preserve"> PAGEREF _Toc229255529 \h </w:instrText>
         </w:r>
         <w:r>
           <w:rPr>
@@ -3120,7 +3120,7 @@
           <w:noProof/>
         </w:rPr>
       </w:pPr>
-      <w:hyperlink w:anchor="_Toc229254593" w:history="1">
+      <w:hyperlink w:anchor="_Toc229255530" w:history="1">
         <w:r>
           <w:rPr>
             <w:rStyle w:val="aff9"/>
@@ -3148,7 +3148,7 @@
             <w:noProof/>
             <w:webHidden/>
           </w:rPr>
-          <w:instrText xml:space="preserve"> PAGEREF _Toc229254593 \h </w:instrText>
+          <w:instrText xml:space="preserve"> PAGEREF _Toc229255530 \h </w:instrText>
         </w:r>
         <w:r>
           <w:rPr>
@@ -3189,7 +3189,7 @@
           <w:noProof/>
         </w:rPr>
       </w:pPr>
-      <w:hyperlink w:anchor="_Toc229254594" w:history="1">
+      <w:hyperlink w:anchor="_Toc229255531" w:history="1">
         <w:r>
           <w:rPr>
             <w:rStyle w:val="aff9"/>
@@ -3217,7 +3217,7 @@
             <w:noProof/>
             <w:webHidden/>
           </w:rPr>
-          <w:instrText xml:space="preserve"> PAGEREF _Toc229254594 \h </w:instrText>
+          <w:instrText xml:space="preserve"> PAGEREF _Toc229255531 \h </w:instrText>
         </w:r>
         <w:r>
           <w:rPr>
@@ -3264,7 +3264,7 @@
         <w:spacing w:before="240" w:after="240"/>
         <w:jc w:val="center"/>
       </w:pPr>
-      <w:bookmarkStart w:id="3" w:name="_Toc229254563"/>
+      <w:bookmarkStart w:id="3" w:name="_Toc229255500"/>
       <w:r>
         <w:rPr>
           <w:rFonts w:ascii="Times New Roman" w:eastAsia="黑体" w:hAnsi="Times New Roman"/>
@@ -3291,7 +3291,7 @@
         <w:pStyle w:val="21"/>
         <w:spacing w:after="120"/>
       </w:pPr>
-      <w:bookmarkStart w:id="4" w:name="_Toc229254564"/>
+      <w:bookmarkStart w:id="4" w:name="_Toc229255501"/>
       <w:r>
         <w:rPr>
           <w:rFonts w:ascii="Times New Roman" w:eastAsia="黑体" w:hAnsi="Times New Roman"/>
@@ -3370,7 +3370,7 @@
         <w:pStyle w:val="21"/>
         <w:spacing w:after="120"/>
       </w:pPr>
-      <w:bookmarkStart w:id="5" w:name="_Toc229254565"/>
+      <w:bookmarkStart w:id="5" w:name="_Toc229255502"/>
       <w:r>
         <w:rPr>
           <w:rFonts w:ascii="Times New Roman" w:eastAsia="黑体" w:hAnsi="Times New Roman"/>
@@ -3403,7 +3403,7 @@
         <w:pStyle w:val="21"/>
         <w:spacing w:after="120"/>
       </w:pPr>
-      <w:bookmarkStart w:id="6" w:name="_Toc229254566"/>
+      <w:bookmarkStart w:id="6" w:name="_Toc229255503"/>
       <w:r>
         <w:rPr>
           <w:rFonts w:ascii="Times New Roman" w:eastAsia="黑体" w:hAnsi="Times New Roman"/>
@@ -3621,7 +3621,7 @@
         <w:pStyle w:val="21"/>
         <w:spacing w:after="120"/>
       </w:pPr>
-      <w:bookmarkStart w:id="7" w:name="_Toc229254567"/>
+      <w:bookmarkStart w:id="7" w:name="_Toc229255504"/>
       <w:r>
         <w:rPr>
           <w:rFonts w:ascii="Times New Roman" w:eastAsia="黑体" w:hAnsi="Times New Roman"/>
@@ -3732,7 +3732,7 @@
         <w:spacing w:before="240" w:after="240"/>
         <w:jc w:val="center"/>
       </w:pPr>
-      <w:bookmarkStart w:id="8" w:name="_Toc229254568"/>
+      <w:bookmarkStart w:id="8" w:name="_Toc229255505"/>
       <w:r>
         <w:rPr>
           <w:rFonts w:ascii="Times New Roman" w:eastAsia="黑体" w:hAnsi="Times New Roman"/>
@@ -3759,7 +3759,7 @@
         <w:pStyle w:val="21"/>
         <w:spacing w:after="120"/>
       </w:pPr>
-      <w:bookmarkStart w:id="9" w:name="_Toc229254569"/>
+      <w:bookmarkStart w:id="9" w:name="_Toc229255506"/>
       <w:r>
         <w:rPr>
           <w:rFonts w:ascii="Times New Roman" w:eastAsia="黑体" w:hAnsi="Times New Roman"/>
@@ -3880,7 +3880,7 @@
         <w:pStyle w:val="21"/>
         <w:spacing w:after="120"/>
       </w:pPr>
-      <w:bookmarkStart w:id="10" w:name="_Toc229254570"/>
+      <w:bookmarkStart w:id="10" w:name="_Toc229255507"/>
       <w:r>
         <w:rPr>
           <w:rFonts w:ascii="Times New Roman" w:eastAsia="黑体" w:hAnsi="Times New Roman"/>
@@ -3934,7 +3934,7 @@
         <w:pStyle w:val="21"/>
         <w:spacing w:after="120"/>
       </w:pPr>
-      <w:bookmarkStart w:id="11" w:name="_Toc229254571"/>
+      <w:bookmarkStart w:id="11" w:name="_Toc229255508"/>
       <w:r>
         <w:rPr>
           <w:rFonts w:ascii="Times New Roman" w:eastAsia="黑体" w:hAnsi="Times New Roman"/>
@@ -4087,7 +4087,7 @@
         <w:spacing w:before="240" w:after="240"/>
         <w:jc w:val="center"/>
       </w:pPr>
-      <w:bookmarkStart w:id="12" w:name="_Toc229254572"/>
+      <w:bookmarkStart w:id="12" w:name="_Toc229255509"/>
       <w:r>
         <w:rPr>
           <w:rFonts w:ascii="Times New Roman" w:eastAsia="黑体" w:hAnsi="Times New Roman"/>
@@ -4114,7 +4114,7 @@
         <w:pStyle w:val="21"/>
         <w:spacing w:after="120"/>
       </w:pPr>
-      <w:bookmarkStart w:id="13" w:name="_Toc229254573"/>
+      <w:bookmarkStart w:id="13" w:name="_Toc229255510"/>
       <w:r>
         <w:rPr>
           <w:rFonts w:ascii="Times New Roman" w:eastAsia="黑体" w:hAnsi="Times New Roman"/>
@@ -4171,7 +4171,7 @@
         <w:pStyle w:val="21"/>
         <w:spacing w:after="120"/>
       </w:pPr>
-      <w:bookmarkStart w:id="14" w:name="_Toc229254574"/>
+      <w:bookmarkStart w:id="14" w:name="_Toc229255511"/>
       <w:r>
         <w:rPr>
           <w:rFonts w:ascii="Times New Roman" w:eastAsia="黑体" w:hAnsi="Times New Roman"/>
@@ -4255,7 +4255,7 @@
         <w:pStyle w:val="21"/>
         <w:spacing w:after="120"/>
       </w:pPr>
-      <w:bookmarkStart w:id="15" w:name="_Toc229254575"/>
+      <w:bookmarkStart w:id="15" w:name="_Toc229255512"/>
       <w:r>
         <w:rPr>
           <w:rFonts w:ascii="Times New Roman" w:eastAsia="黑体" w:hAnsi="Times New Roman"/>
@@ -4333,7 +4333,7 @@
         <w:pStyle w:val="21"/>
         <w:spacing w:after="120"/>
       </w:pPr>
-      <w:bookmarkStart w:id="16" w:name="_Toc229254576"/>
+      <w:bookmarkStart w:id="16" w:name="_Toc229255513"/>
       <w:r>
         <w:rPr>
           <w:rFonts w:ascii="Times New Roman" w:eastAsia="黑体" w:hAnsi="Times New Roman"/>
@@ -4466,7 +4466,7 @@
         <w:spacing w:before="240" w:after="240"/>
         <w:jc w:val="center"/>
       </w:pPr>
-      <w:bookmarkStart w:id="17" w:name="_Toc229254577"/>
+      <w:bookmarkStart w:id="17" w:name="_Toc229255514"/>
       <w:r>
         <w:rPr>
           <w:rFonts w:ascii="Times New Roman" w:eastAsia="黑体" w:hAnsi="Times New Roman"/>
@@ -4493,7 +4493,7 @@
         <w:pStyle w:val="21"/>
         <w:spacing w:after="120"/>
       </w:pPr>
-      <w:bookmarkStart w:id="18" w:name="_Toc229254578"/>
+      <w:bookmarkStart w:id="18" w:name="_Toc229255515"/>
       <w:r>
         <w:rPr>
           <w:rFonts w:ascii="Times New Roman" w:eastAsia="黑体" w:hAnsi="Times New Roman"/>
@@ -4568,7 +4568,7 @@
         <w:pStyle w:val="21"/>
         <w:spacing w:after="120"/>
       </w:pPr>
-      <w:bookmarkStart w:id="19" w:name="_Toc229254579"/>
+      <w:bookmarkStart w:id="19" w:name="_Toc229255516"/>
       <w:r>
         <w:rPr>
           <w:rFonts w:ascii="Times New Roman" w:eastAsia="黑体" w:hAnsi="Times New Roman"/>
@@ -4670,7 +4670,7 @@
         <w:pStyle w:val="21"/>
         <w:spacing w:after="120"/>
       </w:pPr>
-      <w:bookmarkStart w:id="20" w:name="_Toc229254580"/>
+      <w:bookmarkStart w:id="20" w:name="_Toc229255517"/>
       <w:r>
         <w:rPr>
           <w:rFonts w:ascii="Times New Roman" w:eastAsia="黑体" w:hAnsi="Times New Roman"/>
@@ -4769,7 +4769,7 @@
         <w:pStyle w:val="21"/>
         <w:spacing w:after="120"/>
       </w:pPr>
-      <w:bookmarkStart w:id="21" w:name="_Toc229254581"/>
+      <w:bookmarkStart w:id="21" w:name="_Toc229255518"/>
       <w:r>
         <w:rPr>
           <w:rFonts w:ascii="Times New Roman" w:eastAsia="黑体" w:hAnsi="Times New Roman"/>
@@ -4839,7 +4839,7 @@
         <w:pStyle w:val="21"/>
         <w:spacing w:after="120"/>
       </w:pPr>
-      <w:bookmarkStart w:id="22" w:name="_Toc229254582"/>
+      <w:bookmarkStart w:id="22" w:name="_Toc229255519"/>
       <w:r>
         <w:rPr>
           <w:rFonts w:ascii="Times New Roman" w:eastAsia="黑体" w:hAnsi="Times New Roman"/>
@@ -4982,7 +4982,7 @@
         <w:spacing w:before="240" w:after="240"/>
         <w:jc w:val="center"/>
       </w:pPr>
-      <w:bookmarkStart w:id="23" w:name="_Toc229254583"/>
+      <w:bookmarkStart w:id="23" w:name="_Toc229255520"/>
       <w:r>
         <w:rPr>
           <w:rFonts w:ascii="Times New Roman" w:eastAsia="黑体" w:hAnsi="Times New Roman"/>
@@ -5009,7 +5009,7 @@
         <w:pStyle w:val="21"/>
         <w:spacing w:after="120"/>
       </w:pPr>
-      <w:bookmarkStart w:id="24" w:name="_Toc229254584"/>
+      <w:bookmarkStart w:id="24" w:name="_Toc229255521"/>
       <w:r>
         <w:rPr>
           <w:rFonts w:ascii="Times New Roman" w:eastAsia="黑体" w:hAnsi="Times New Roman"/>
@@ -5099,7 +5099,7 @@
         <w:pStyle w:val="21"/>
         <w:spacing w:after="120"/>
       </w:pPr>
-      <w:bookmarkStart w:id="25" w:name="_Toc229254585"/>
+      <w:bookmarkStart w:id="25" w:name="_Toc229255522"/>
       <w:r>
         <w:rPr>
           <w:rFonts w:ascii="Times New Roman" w:eastAsia="黑体" w:hAnsi="Times New Roman"/>
@@ -5341,7 +5341,7 @@
         <w:pStyle w:val="21"/>
         <w:spacing w:after="120"/>
       </w:pPr>
-      <w:bookmarkStart w:id="26" w:name="_Toc229254586"/>
+      <w:bookmarkStart w:id="26" w:name="_Toc229255523"/>
       <w:r>
         <w:rPr>
           <w:rFonts w:ascii="Times New Roman" w:eastAsia="黑体" w:hAnsi="Times New Roman"/>
@@ -6064,7 +6064,7 @@
         <w:pStyle w:val="21"/>
         <w:spacing w:after="120"/>
       </w:pPr>
-      <w:bookmarkStart w:id="27" w:name="_Toc229254587"/>
+      <w:bookmarkStart w:id="27" w:name="_Toc229255524"/>
       <w:r>
         <w:rPr>
           <w:rFonts w:ascii="Times New Roman" w:eastAsia="黑体" w:hAnsi="Times New Roman"/>
@@ -6799,7 +6799,7 @@
         <w:pStyle w:val="21"/>
         <w:spacing w:after="120"/>
       </w:pPr>
-      <w:bookmarkStart w:id="28" w:name="_Toc229254588"/>
+      <w:bookmarkStart w:id="28" w:name="_Toc229255525"/>
       <w:r>
         <w:rPr>
           <w:rFonts w:ascii="Times New Roman" w:eastAsia="黑体" w:hAnsi="Times New Roman"/>
@@ -6978,7 +6978,7 @@
         <w:pStyle w:val="21"/>
         <w:spacing w:after="120"/>
       </w:pPr>
-      <w:bookmarkStart w:id="29" w:name="_Toc229254589"/>
+      <w:bookmarkStart w:id="29" w:name="_Toc229255526"/>
       <w:r>
         <w:rPr>
           <w:rFonts w:ascii="Times New Roman" w:eastAsia="黑体" w:hAnsi="Times New Roman"/>
@@ -7209,6 +7209,104 @@
       </w:r>
     </w:p>
     <w:p>
+      <w:pPr>
+        <w:spacing w:after="0" w:line="360" w:lineRule="auto"/>
+        <w:ind w:firstLine="480"/>
+        <w:jc w:val="both"/>
+      </w:pPr>
+      <w:r>
+        <w:t>在生成样本展示和后续扩充方面，系统进一步补充了导出层优化。原始导出方式直接保存随机噪声生成的样本，可能混入少量低对比度或纹理较弱的图像。改进后，系统支持潜变量截断、多候选质量优选和真实类别统计匹配：先生成更多候选样本，再根据清晰度、灰度对比度和亮度范围进行排序，最后参考真实样</w:t>
+      </w:r>
+      <w:r>
+        <w:t>本的均值和标准差调整生成图像。该步骤不改变</w:t>
+      </w:r>
+      <w:r>
+        <w:t xml:space="preserve"> GAN </w:t>
+      </w:r>
+      <w:r>
+        <w:t>模型结构，但能提高导出样本的可展示性和纹理一致性。</w:t>
+      </w:r>
+    </w:p>
+    <w:p>
+      <w:pPr>
+        <w:jc w:val="center"/>
+      </w:pPr>
+      <w:r>
+        <w:rPr>
+          <w:noProof/>
+        </w:rPr>
+        <w:drawing>
+          <wp:inline distT="0" distB="0" distL="0" distR="0">
+            <wp:extent cx="5486400" cy="3242125"/>
+            <wp:effectExtent l="0" t="0" r="0" b="0"/>
+            <wp:docPr id="5" name="Picture 5"/>
+            <wp:cNvGraphicFramePr>
+              <a:graphicFrameLocks xmlns:a="http://schemas.openxmlformats.org/drawingml/2006/main" noChangeAspect="1"/>
+            </wp:cNvGraphicFramePr>
+            <a:graphic xmlns:a="http://schemas.openxmlformats.org/drawingml/2006/main">
+              <a:graphicData uri="http://schemas.openxmlformats.org/drawingml/2006/picture">
+                <pic:pic xmlns:pic="http://schemas.openxmlformats.org/drawingml/2006/picture">
+                  <pic:nvPicPr>
+                    <pic:cNvPr id="0" name="generation_quality_preview.png"/>
+                    <pic:cNvPicPr/>
+                  </pic:nvPicPr>
+                  <pic:blipFill>
+                    <a:blip r:embed="rId12"/>
+                    <a:stretch>
+                      <a:fillRect/>
+                    </a:stretch>
+                  </pic:blipFill>
+                  <pic:spPr>
+                    <a:xfrm>
+                      <a:off x="0" y="0"/>
+                      <a:ext cx="5486400" cy="3242125"/>
+                    </a:xfrm>
+                    <a:prstGeom prst="rect">
+                      <a:avLst/>
+                    </a:prstGeom>
+                  </pic:spPr>
+                </pic:pic>
+              </a:graphicData>
+            </a:graphic>
+          </wp:inline>
+        </w:drawing>
+      </w:r>
+    </w:p>
+    <w:p>
+      <w:pPr>
+        <w:spacing w:after="120"/>
+        <w:jc w:val="center"/>
+      </w:pPr>
+      <w:r>
+        <w:rPr>
+          <w:sz w:val="21"/>
+        </w:rPr>
+        <w:t>图</w:t>
+      </w:r>
+      <w:r>
+        <w:rPr>
+          <w:sz w:val="21"/>
+        </w:rPr>
+        <w:t xml:space="preserve"> 5 </w:t>
+      </w:r>
+      <w:r>
+        <w:rPr>
+          <w:sz w:val="21"/>
+        </w:rPr>
+        <w:t>生成样本导出策略对比</w:t>
+      </w:r>
+    </w:p>
+    <w:p>
+      <w:pPr>
+        <w:spacing w:after="0" w:line="360" w:lineRule="auto"/>
+        <w:ind w:firstLine="480"/>
+        <w:jc w:val="both"/>
+      </w:pPr>
+      <w:r>
+        <w:t>图中以麻点缺陷为例，对比普通随机导出、质量优选导出和真实统计匹配后的效果。质量优选主要减少模糊或灰度异常样本，真实统计匹配进一步提升局部纹理对比度，使生成样本在视觉上更接近真实工业表面。该结果适合用于答辩展示，但正式下游性能仍应通过重新训练分类器和多随机种子验证确认，避免只凭视觉效果判断增强质量。</w:t>
+      </w:r>
+    </w:p>
+    <w:p>
       <w:r>
         <w:br w:type="page"/>
       </w:r>
@@ -7219,7 +7317,7 @@
         <w:spacing w:before="240" w:after="240"/>
         <w:jc w:val="center"/>
       </w:pPr>
-      <w:bookmarkStart w:id="30" w:name="_Toc229254590"/>
+      <w:bookmarkStart w:id="30" w:name="_Toc229255527"/>
       <w:r>
         <w:rPr>
           <w:rFonts w:ascii="Times New Roman" w:eastAsia="黑体" w:hAnsi="Times New Roman"/>
@@ -7248,7 +7346,10 @@
         <w:jc w:val="both"/>
       </w:pPr>
       <w:r>
-        <w:t>系统测试包括功能测试、烟测和复现检查。功能测试确认预处理、</w:t>
+        <w:t>系统测试包括功能测试、烟测和复现检查。功能测试确认预</w:t>
+      </w:r>
+      <w:r>
+        <w:t>处理、</w:t>
       </w:r>
       <w:r>
         <w:t xml:space="preserve">GAN </w:t>
@@ -7266,10 +7367,7 @@
         <w:t>README</w:t>
       </w:r>
       <w:r>
-        <w:t>、答辩文档、核心证据图、比例消融结果、多种</w:t>
-      </w:r>
-      <w:r>
-        <w:t>子结果、工业就绪度</w:t>
+        <w:t>、答辩文档、核心证据图、比例消融结果、多种子结果、工业就绪度</w:t>
       </w:r>
       <w:r>
         <w:t xml:space="preserve"> JSON</w:t>
@@ -7336,13 +7434,13 @@
         <w:t>系统界面测试显示，</w:t>
       </w:r>
       <w:r>
-        <w:t xml:space="preserve">Streamlit </w:t>
-      </w:r>
-      <w:r>
-        <w:t>首页可正常访问，侧边栏能够切换各功能模块。答辩材料与健康检查模块可以集中展示关键路径、文档和证据图，减少现场查找文件的风险。分类验证模块能够导出低置信度样本，便于人工复核；目标检测模块能够完</w:t>
-      </w:r>
-      <w:r>
-        <w:t>成小样本训练和</w:t>
+        <w:t>Stre</w:t>
+      </w:r>
+      <w:r>
+        <w:t xml:space="preserve">amlit </w:t>
+      </w:r>
+      <w:r>
+        <w:t>首页可正常访问，侧边栏能够切换各功能模块。答辩材料与健康检查模块可以集中展示关键路径、文档和证据图，减少现场查找文件的风险。分类验证模块能够导出低置信度样本，便于人工复核；目标检测模块能够完成小样本训练和</w:t>
       </w:r>
       <w:r>
         <w:t xml:space="preserve"> AP50 </w:t>
@@ -7363,7 +7461,7 @@
           <wp:inline distT="0" distB="0" distL="0" distR="0">
             <wp:extent cx="5486400" cy="3731656"/>
             <wp:effectExtent l="0" t="0" r="0" b="0"/>
-            <wp:docPr id="5" name="Picture 5"/>
+            <wp:docPr id="6" name="Picture 6"/>
             <wp:cNvGraphicFramePr>
               <a:graphicFrameLocks xmlns:a="http://schemas.openxmlformats.org/drawingml/2006/main" noChangeAspect="1"/>
             </wp:cNvGraphicFramePr>
@@ -7375,7 +7473,7 @@
                     <pic:cNvPicPr/>
                   </pic:nvPicPr>
                   <pic:blipFill>
-                    <a:blip r:embed="rId12"/>
+                    <a:blip r:embed="rId13"/>
                     <a:stretch>
                       <a:fillRect/>
                     </a:stretch>
@@ -7411,7 +7509,7 @@
         <w:rPr>
           <w:sz w:val="21"/>
         </w:rPr>
-        <w:t xml:space="preserve"> 5 </w:t>
+        <w:t xml:space="preserve"> 6 </w:t>
       </w:r>
       <w:r>
         <w:rPr>
@@ -7455,7 +7553,10 @@
       </w:r>
       <w:r>
         <w:lastRenderedPageBreak/>
-        <w:t>判断和答辩材料生成的完整流程。该图适合作为论文系统设计章节或答辩总结页的总览图，用于说明本课题并非只训练一个</w:t>
+        <w:t>判断和</w:t>
+      </w:r>
+      <w:r>
+        <w:t>答辩材料生成的完整流程。该图适合作为论文系统设计章节或答辩总结页的总览图，用于说明本课题并非只训练一个</w:t>
       </w:r>
       <w:r>
         <w:t xml:space="preserve"> GAN </w:t>
@@ -7471,10 +7572,7 @@
         <w:jc w:val="both"/>
       </w:pPr>
       <w:r>
-        <w:t>从工程交付角度看，本系统还特别关注</w:t>
-      </w:r>
-      <w:r>
-        <w:t>实验留痕。每次关键实验均尽量保存参数、结果表、</w:t>
+        <w:t>从工程交付角度看，本系统还特别关注实验留痕。每次关键实验均尽量保存参数、结果表、</w:t>
       </w:r>
       <w:r>
         <w:t xml:space="preserve">JSON </w:t>
@@ -7492,7 +7590,10 @@
         <w:t>”</w:t>
       </w:r>
       <w:r>
-        <w:t>，也便于后续继续扩展检测验证或论文实验章节。对于工业应用场景，实验留痕同样重要，因为生产环境中的缺陷样本往往具有批次差异和工艺差异，只有保留配置与结果，才能判断一次模型提升是来自算法改进、数据变化还是训练随机性。</w:t>
+        <w:t>，也便于后续继续扩展检测验证或论文实验章节。对于工业应用场景，实验留痕同样重要，因为生产环境中的缺陷样本往往具有批次差异和工艺差异</w:t>
+      </w:r>
+      <w:r>
+        <w:t>，只有保留配置与结果，才能判断一次模型提升是来自算法改进、数据变化还是训练随机性。</w:t>
       </w:r>
     </w:p>
     <w:p>
@@ -7506,7 +7607,7 @@
         <w:spacing w:before="240" w:after="240"/>
         <w:jc w:val="center"/>
       </w:pPr>
-      <w:bookmarkStart w:id="31" w:name="_Toc229254591"/>
+      <w:bookmarkStart w:id="31" w:name="_Toc229255528"/>
       <w:r>
         <w:rPr>
           <w:rFonts w:ascii="Times New Roman" w:eastAsia="黑体" w:hAnsi="Times New Roman"/>
@@ -7541,10 +7642,7 @@
         <w:t xml:space="preserve"> 600 </w:t>
       </w:r>
       <w:r>
-        <w:t>张方案下取得了较好分类结果，但纹理多样性还可以继续提高，</w:t>
-      </w:r>
-      <w:r>
-        <w:t>以减少同类样本过于相似的问题。比例消融目前主要在</w:t>
+        <w:t>张方案下取得了较好分类结果，但纹理多样性还可以继续提高，以减少同类样本过于相似的问题。比例消融目前主要在</w:t>
       </w:r>
       <w:r>
         <w:t xml:space="preserve"> seed 42 </w:t>
@@ -7583,7 +7681,10 @@
         <w:t>和</w:t>
       </w:r>
       <w:r>
-        <w:t xml:space="preserve"> MobileNetV3-Small </w:t>
+        <w:t xml:space="preserve"> Mob</w:t>
+      </w:r>
+      <w:r>
+        <w:t xml:space="preserve">ileNetV3-Small </w:t>
       </w:r>
       <w:r>
         <w:t>的默认参数表现不如</w:t>
@@ -7611,10 +7712,7 @@
         <w:t>未来工作可以从三方面展开。模型方面，可尝试</w:t>
       </w:r>
       <w:r>
-        <w:t xml:space="preserve"> ACGA</w:t>
-      </w:r>
-      <w:r>
-        <w:t>N</w:t>
+        <w:t xml:space="preserve"> ACGAN</w:t>
       </w:r>
       <w:r>
         <w:t>、</w:t>
@@ -7653,7 +7751,10 @@
         <w:t xml:space="preserve">Word/PPT </w:t>
       </w:r>
       <w:r>
-        <w:t>导出和更完整的实验管理。对于工业落地，还可以保留低置信度样本人工复核通道，并将复核样本用于主动学习。</w:t>
+        <w:t>导出和更完整的实验管理。对于工业落地，还可以保留低置信度样本人工复核通道，并将复核样本用于主</w:t>
+      </w:r>
+      <w:r>
+        <w:t>动学习。</w:t>
       </w:r>
     </w:p>
     <w:p>
@@ -7667,7 +7768,7 @@
         <w:spacing w:before="240" w:after="240"/>
         <w:jc w:val="center"/>
       </w:pPr>
-      <w:bookmarkStart w:id="32" w:name="_Toc229254592"/>
+      <w:bookmarkStart w:id="32" w:name="_Toc229255529"/>
       <w:r>
         <w:rPr>
           <w:rFonts w:ascii="Times New Roman" w:eastAsia="黑体" w:hAnsi="Times New Roman"/>
@@ -7714,10 +7815,7 @@
         <w:t xml:space="preserve">cGAN </w:t>
       </w:r>
       <w:r>
-        <w:t>生成、质量评估、</w:t>
-      </w:r>
-      <w:r>
-        <w:t>样本筛选、下游验证到工业就绪度分析的闭环。实验表明，</w:t>
+        <w:t>生成、质量评估、样本筛选、下游验证到工业就绪度分析的闭环。实验表明，</w:t>
       </w:r>
       <w:r>
         <w:t xml:space="preserve">cGAN-v2 40 </w:t>
@@ -7756,7 +7854,10 @@
         <w:t>随机种子复验中，增强组平均最佳准确率达到</w:t>
       </w:r>
       <w:r>
-        <w:t xml:space="preserve"> 99.44%</w:t>
+        <w:t xml:space="preserve"> </w:t>
+      </w:r>
+      <w:r>
+        <w:t>99.44%</w:t>
       </w:r>
       <w:r>
         <w:t>，高于原始基线的</w:t>
@@ -7781,10 +7882,7 @@
         <w:t xml:space="preserve"> GAN </w:t>
       </w:r>
       <w:r>
-        <w:t>增强保持了相对谨慎的判断：它并非在任何设置下都优于传统增强，实际收益取决于生成质量、样本筛选、加入比例和训练策略。论文通过质量指标、比例消融、多随机种子、类别召</w:t>
-      </w:r>
-      <w:r>
-        <w:t>回率和低置信度样本分析，对这一判断进行了验证。系统将上述环节整合为可运行、可展示、可复验的软件平台，为工业缺陷检测数据扩充和毕业设计答辩提供了较完整的支撑。</w:t>
+        <w:t>增强保持了相对谨慎的判断：它并非在任何设置下都优于传统增强，实际收益取决于生成质量、样本筛选、加入比例和训练策略。论文通过质量指标、比例消融、多随机种子、类别召回率和低置信度样本分析，对这一判断进行了验证。系统将上述环节整合为可运行、可展示、可复验的软件平台，为工业缺陷检测数据扩充和毕业设计答辩提供了较完整的支撑。</w:t>
       </w:r>
     </w:p>
     <w:p>
@@ -7798,7 +7896,7 @@
         <w:spacing w:before="240" w:after="240"/>
         <w:jc w:val="center"/>
       </w:pPr>
-      <w:bookmarkStart w:id="33" w:name="_Toc229254593"/>
+      <w:bookmarkStart w:id="33" w:name="_Toc229255530"/>
       <w:r>
         <w:rPr>
           <w:rFonts w:ascii="Times New Roman" w:eastAsia="黑体" w:hAnsi="Times New Roman"/>
@@ -7814,7 +7912,10 @@
         <w:jc w:val="both"/>
       </w:pPr>
       <w:r>
-        <w:t>[1] Goodfellow I., Pouget-Abadie J., Mirza M., et al. Generative Adversarial Nets. Advances in Neural Information Processing Systems, 2014.</w:t>
+        <w:t>[1] Goodfellow I., Pouget-Abadie J., Mirza M., et al. Gener</w:t>
+      </w:r>
+      <w:r>
+        <w:t>ative Adversarial Nets. Advances in Neural Information Processing Systems, 2014.</w:t>
       </w:r>
     </w:p>
     <w:p>
@@ -7823,10 +7924,7 @@
         <w:jc w:val="both"/>
       </w:pPr>
       <w:r>
-        <w:t xml:space="preserve">[2] Mirza M., Osindero S. </w:t>
-      </w:r>
-      <w:r>
-        <w:t>Conditional Generative Adversarial Nets. arXiv preprint arXiv:1411.1784, 2014.</w:t>
+        <w:t>[2] Mirza M., Osindero S. Conditional Generative Adversarial Nets. arXiv preprint arXiv:1411.1784, 2014.</w:t>
       </w:r>
     </w:p>
     <w:p>
@@ -7835,7 +7933,10 @@
         <w:jc w:val="both"/>
       </w:pPr>
       <w:r>
-        <w:t>[3] Radford A., Metz L., Chintala S. Unsupervised Representation Learning with Deep Convolutional Generative Adversarial Networks. ICLR, 2016.</w:t>
+        <w:t>[3] Radford A., Metz L., Chintala S. Unsupervised Representation Learn</w:t>
+      </w:r>
+      <w:r>
+        <w:t>ing with Deep Convolutional Generative Adversarial Networks. ICLR, 2016.</w:t>
       </w:r>
     </w:p>
     <w:p>
@@ -7844,10 +7945,7 @@
         <w:jc w:val="both"/>
       </w:pPr>
       <w:r>
-        <w:t xml:space="preserve">[4] Mao X., Li Q., Xie H., et al. </w:t>
-      </w:r>
-      <w:r>
-        <w:t>Least Squares Generative Adversarial Networks. ICCV, 2017.</w:t>
+        <w:t>[4] Mao X., Li Q., Xie H., et al. Least Squares Generative Adversarial Networks. ICCV, 2017.</w:t>
       </w:r>
     </w:p>
     <w:p>
@@ -7856,7 +7954,10 @@
         <w:jc w:val="both"/>
       </w:pPr>
       <w:r>
-        <w:t>[5] Miyato T., Kataoka T., Koyama M., Yoshida Y. Spectral Normalization for Generative Adversarial Networks. ICLR, 2018.</w:t>
+        <w:t>[5] Miyato T., Kataoka T., Koyama M., Yoshida Y. Spectral Normalization for Generative Adv</w:t>
+      </w:r>
+      <w:r>
+        <w:t>ersarial Networks. ICLR, 2018.</w:t>
       </w:r>
     </w:p>
     <w:p>
@@ -7865,10 +7966,7 @@
         <w:jc w:val="both"/>
       </w:pPr>
       <w:r>
-        <w:t>[6] He K., Zhang X., Ren S., Sun J. Deep Residual Learning for Image Recogni</w:t>
-      </w:r>
-      <w:r>
-        <w:t>tion. CVPR, 2016.</w:t>
+        <w:t>[6] He K., Zhang X., Ren S., Sun J. Deep Residual Learning for Image Recognition. CVPR, 2016.</w:t>
       </w:r>
     </w:p>
     <w:p>
@@ -7877,7 +7975,10 @@
         <w:jc w:val="both"/>
       </w:pPr>
       <w:r>
-        <w:t>[7] Wang Z., Bovik A. C., Sheikh H. R., Simoncelli E. P. Image Quality Assessment: From Error Visibility to Structural Similarity. IEEE Transactions on Image Processing, 2004.</w:t>
+        <w:t xml:space="preserve">[7] Wang Z., Bovik A. C., Sheikh H. R., Simoncelli E. P. Image Quality Assessment: From Error Visibility to Structural Similarity. </w:t>
+      </w:r>
+      <w:r>
+        <w:t>IEEE Transactions on Image Processing, 2004.</w:t>
       </w:r>
     </w:p>
     <w:p>
@@ -7886,10 +7987,7 @@
         <w:jc w:val="both"/>
       </w:pPr>
       <w:r>
-        <w:t>[8] Heusel M., Ramsauer H., Unterthiner T., Nessler B., Hochre</w:t>
-      </w:r>
-      <w:r>
-        <w:t>iter S. GANs Trained by a Two Time-Scale Update Rule Converge to a Local Nash Equilibrium. NeurIPS, 2017.</w:t>
+        <w:t>[8] Heusel M., Ramsauer H., Unterthiner T., Nessler B., Hochreiter S. GANs Trained by a Two Time-Scale Update Rule Converge to a Local Nash Equilibrium. NeurIPS, 2017.</w:t>
       </w:r>
     </w:p>
     <w:p>
@@ -7898,10 +7996,10 @@
         <w:jc w:val="both"/>
       </w:pPr>
       <w:r>
-        <w:t>[9] Song K., Yan Y. A Noise Robust Method Based on Completed Local Binary Patterns for Hot-Rolled Steel Strip Surface Defects. Applied Surface Science</w:t>
-      </w:r>
-      <w:r>
-        <w:t>, 2013.</w:t>
+        <w:t xml:space="preserve">[9] Song K., Yan Y. A Noise Robust Method </w:t>
+      </w:r>
+      <w:r>
+        <w:t>Based on Completed Local Binary Patterns for Hot-Rolled Steel Strip Surface Defects. Applied Surface Science, 2013.</w:t>
       </w:r>
     </w:p>
     <w:p>
@@ -7919,7 +8017,10 @@
         <w:jc w:val="both"/>
       </w:pPr>
       <w:r>
-        <w:t>[11] Redmon J., Farhadi A. YOLOv3: An Incremental Improvement. arXiv preprint arXiv:1804.02767, 2018.</w:t>
+        <w:t xml:space="preserve">[11] </w:t>
+      </w:r>
+      <w:r>
+        <w:t>Redmon J., Farhadi A. YOLOv3: An Incremental Improvement. arXiv preprint arXiv:1804.02767, 2018.</w:t>
       </w:r>
     </w:p>
     <w:p>
@@ -7928,10 +8029,7 @@
         <w:jc w:val="both"/>
       </w:pPr>
       <w:r>
-        <w:t>[12] Howard</w:t>
-      </w:r>
-      <w:r>
-        <w:t xml:space="preserve"> A., Sandler M., Chu G., et al. Searching for MobileNetV3. ICCV, 2019.</w:t>
+        <w:t>[12] Howard A., Sandler M., Chu G., et al. Searching for MobileNetV3. ICCV, 2019.</w:t>
       </w:r>
     </w:p>
     <w:p>
@@ -7945,7 +8043,7 @@
         <w:spacing w:before="240" w:after="240"/>
         <w:jc w:val="center"/>
       </w:pPr>
-      <w:bookmarkStart w:id="34" w:name="_Toc229254594"/>
+      <w:bookmarkStart w:id="34" w:name="_Toc229255531"/>
       <w:r>
         <w:rPr>
           <w:rFonts w:ascii="Times New Roman" w:eastAsia="黑体" w:hAnsi="Times New Roman"/>
@@ -7983,7 +8081,10 @@
         <w:t>、</w:t>
       </w:r>
       <w:r>
-        <w:t xml:space="preserve">torchvision </w:t>
+        <w:t>torchvisio</w:t>
+      </w:r>
+      <w:r>
+        <w:t xml:space="preserve">n </w:t>
       </w:r>
       <w:r>
         <w:t>等工具。通过本次毕业设计，我对工业视觉检测、生成对抗网络、实验评估和软件工程集成有了更完整的认识。项目开发过程中，模型训练不稳定、实验结果波动和界面细节问题都促使我从</w:t>
@@ -8014,7 +8115,7 @@
       </w:r>
     </w:p>
     <w:sectPr>
-      <w:footerReference w:type="default" r:id="rId13"/>
+      <w:footerReference w:type="default" r:id="rId14"/>
       <w:pgSz w:w="11906" w:h="16838"/>
       <w:pgMar w:top="1440" w:right="1474" w:bottom="1440" w:left="1701" w:header="720" w:footer="720" w:gutter="0"/>
       <w:pgNumType w:start="1"/>
@@ -19711,7 +19812,7 @@
     <w:autoRedefine/>
     <w:uiPriority w:val="39"/>
     <w:unhideWhenUsed/>
-    <w:rsid w:val="0084479B"/>
+    <w:rsid w:val="0007744E"/>
   </w:style>
   <w:style w:type="paragraph" w:styleId="TOC2">
     <w:name w:val="toc 2"/>
@@ -19720,7 +19821,7 @@
     <w:autoRedefine/>
     <w:uiPriority w:val="39"/>
     <w:unhideWhenUsed/>
-    <w:rsid w:val="0084479B"/>
+    <w:rsid w:val="0007744E"/>
     <w:pPr>
       <w:ind w:leftChars="200" w:left="420"/>
     </w:pPr>
@@ -19730,7 +19831,7 @@
     <w:basedOn w:val="a2"/>
     <w:uiPriority w:val="99"/>
     <w:unhideWhenUsed/>
-    <w:rsid w:val="0084479B"/>
+    <w:rsid w:val="0007744E"/>
     <w:rPr>
       <w:color w:val="0000FF" w:themeColor="hyperlink"/>
       <w:u w:val="single"/>
@@ -20064,7 +20165,7 @@
 </file>
 
 <file path=customXml/itemProps1.xml><?xml version="1.0" encoding="utf-8"?>
-<ds:datastoreItem xmlns:ds="http://schemas.openxmlformats.org/officeDocument/2006/customXml" ds:itemID="{C15B9BED-CE54-4407-A21D-DF2D337F8FCB}">
+<ds:datastoreItem xmlns:ds="http://schemas.openxmlformats.org/officeDocument/2006/customXml" ds:itemID="{22C1ABDE-570B-4995-9372-538BAF2B7506}">
   <ds:schemaRefs>
     <ds:schemaRef ds:uri="http://schemas.openxmlformats.org/officeDocument/2006/bibliography"/>
   </ds:schemaRefs>

</xml_diff>

<commit_message>
docs: add multiseed ratio ablation evidence
</commit_message>
<xml_diff>
--- a/毕业论文_初稿_格式化.docx
+++ b/毕业论文_初稿_格式化.docx
@@ -200,7 +200,7 @@
           <w:color w:val="000000"/>
           <w:sz w:val="24"/>
         </w:rPr>
-        <w:t>实验在 RTX 3070 CUDA 环境下完成。40 轮 cGAN-v2 生成样本的 FID 降至 178.41；生成比例消融显示，每类加入 100 张、共 600 张生成样本时，轻量 CNN 的最佳验证准确率达到 99.72%，最终验证准确率达到 98.61%，并通过由最佳准确率、最低类别召回率和代价加权错误率组成的工业就绪度门槛。3 个随机种子复验中，600 张 cGAN-v2 增强组平均最佳验证准确率为 99.44%，原始基线为 98.15%。系统还补充了 ResNet18、MobileNetV3-Small 分类器对比、低置信度样本导出和 Faster R-CNN MobileNet-FPN 目标检测入口。总体来看，生成式增强的效果并不只取决于“生成了多少图”，还与生成质量、筛选策略、加入比例、早停和复现实验设置有关。本课题最终得到了一套可运行、可观察、可评估、可复验的工业缺陷数据增强实验平台。</w:t>
+        <w:t>实验在 RTX 3070 CUDA 环境下完成。40 轮 cGAN-v2 生成样本的 FID 降至 178.41；生成比例消融采用 42、7、123 三个随机种子复验，每类 50 张、共 300 张方案的平均最佳验证准确率为 98.70%，每类 100 张、共 600 张方案的平均最终验证准确率为 95.74%。在 seed 42 工业门槛验证中，600 张方案最佳验证准确率达到 99.72%，最低类别召回率达到 98.33%，通过由最佳准确率、最低类别召回率和代价加权错误率组成的工业就绪度门槛。系统还补充了 ResNet18、MobileNetV3-Small 分类器对比、低置信度样本导出和 Faster R-CNN MobileNet-FPN 目标检测入口。总体来看，生成式增强的效果并不只取决于“生成了多少图”，还与生成质量、筛选策略、加入比例、早停和复现实验设置有关。本课题最终得到了一套可运行、可观察、可评估、可复验的工业缺陷数据增强实验平台。</w:t>
       </w:r>
     </w:p>
     <w:p>
@@ -233,95 +233,6 @@
     </w:p>
     <w:p>
       <w:pPr>
-        <w:pStyle w:val="Heading1"/>
-        <w:spacing w:before="240" w:after="240"/>
-        <w:jc w:val="center"/>
-      </w:pPr>
-      <w:r>
-        <w:rPr>
-          <w:rFonts w:ascii="Times New Roman" w:hAnsi="Times New Roman" w:eastAsia="黑体"/>
-          <w:b/>
-          <w:color w:val="000000"/>
-          <w:sz w:val="32"/>
-        </w:rPr>
-        <w:t>Abstract</w:t>
-      </w:r>
-    </w:p>
-    <w:p>
-      <w:pPr>
-        <w:spacing w:line="360" w:lineRule="auto" w:before="0" w:after="0"/>
-        <w:ind w:firstLine="480"/>
-        <w:jc w:val="both"/>
-      </w:pPr>
-      <w:r>
-        <w:rPr>
-          <w:rFonts w:ascii="Times New Roman" w:hAnsi="Times New Roman" w:eastAsia="宋体"/>
-          <w:color w:val="000000"/>
-          <w:sz w:val="24"/>
-        </w:rPr>
-        <w:t>Industrial surface defect inspection is an important task in intelligent manufacturing. Deep learning methods have achieved strong performance in visual inspection, but they usually require sufficient and balanced training data. In real production scenarios, defect images are costly to collect and annotate, and rare defects may be under-represented. To address this problem, this thesis designs and implements a data augmentation system for metal surface defects based on conditional generative adversarial networks.</w:t>
-      </w:r>
-    </w:p>
-    <w:p>
-      <w:pPr>
-        <w:spacing w:line="360" w:lineRule="auto" w:before="0" w:after="0"/>
-        <w:ind w:firstLine="480"/>
-        <w:jc w:val="both"/>
-      </w:pPr>
-      <w:r>
-        <w:rPr>
-          <w:rFonts w:ascii="Times New Roman" w:hAnsi="Times New Roman" w:eastAsia="宋体"/>
-          <w:color w:val="000000"/>
-          <w:sz w:val="24"/>
-        </w:rPr>
-        <w:t>The system is built with Python, PyTorch, OpenCV and Streamlit. It integrates data preprocessing, traditional augmentation, cGAN-based generative augmentation, image quality evaluation, sample filtering, downstream classification validation, industrial readiness analysis and defense-oriented report generation. The preprocessing module supports grayscale conversion, resizing, ROI cropping, CLAHE contrast enhancement and median filtering. The generative module introduces Upsample+Conv blocks, LSGAN loss, spectral normalization, projection discriminator, hinge loss, DiffAugment and EMA export to improve training stability and generation quality. The evaluation module combines FID, SSIM, PSNR and downstream classifier performance.</w:t>
-      </w:r>
-    </w:p>
-    <w:p>
-      <w:pPr>
-        <w:spacing w:line="360" w:lineRule="auto" w:before="0" w:after="0"/>
-        <w:ind w:firstLine="480"/>
-        <w:jc w:val="both"/>
-      </w:pPr>
-      <w:r>
-        <w:rPr>
-          <w:rFonts w:ascii="Times New Roman" w:hAnsi="Times New Roman" w:eastAsia="宋体"/>
-          <w:color w:val="000000"/>
-          <w:sz w:val="24"/>
-        </w:rPr>
-        <w:t>Experimental results show that the system can run successfully on a local CUDA device. After the April optimization, the 40-epoch cGAN-v2 reduced FID to 178.41. In the ratio ablation experiment, adding 100 generated samples per class achieved 99.72% best validation accuracy and passed the industrial readiness gate. Multi-seed validation further showed that the augmented setting achieved 99.44% average best validation accuracy, compared with 98.15% for the original baseline. The system also supports ResNet18/MobileNet comparison, low-confidence sample export and a lightweight object detection validation entrance. Overall, the thesis provides a reproducible and extensible workflow for industrial defect data augmentation.</w:t>
-      </w:r>
-    </w:p>
-    <w:p>
-      <w:pPr>
-        <w:spacing w:line="360" w:lineRule="auto" w:before="0" w:after="0"/>
-        <w:jc w:val="both"/>
-      </w:pPr>
-      <w:r>
-        <w:rPr>
-          <w:rFonts w:ascii="Times New Roman" w:hAnsi="Times New Roman" w:eastAsia="黑体"/>
-          <w:b/>
-          <w:color w:val="000000"/>
-          <w:sz w:val="24"/>
-        </w:rPr>
-        <w:t xml:space="preserve">Keywords: </w:t>
-      </w:r>
-      <w:r>
-        <w:rPr>
-          <w:rFonts w:ascii="Times New Roman" w:hAnsi="Times New Roman" w:eastAsia="宋体"/>
-          <w:color w:val="000000"/>
-          <w:sz w:val="24"/>
-        </w:rPr>
-        <w:t>industrial surface defect; data augmentation; GAN; cGAN; image quality evaluation; Streamlit</w:t>
-      </w:r>
-    </w:p>
-    <w:p>
-      <w:r>
-        <w:br w:type="page"/>
-      </w:r>
-    </w:p>
-    <w:p>
-      <w:pPr>
         <w:spacing w:before="240" w:after="240"/>
         <w:jc w:val="center"/>
       </w:pPr>
@@ -1048,6 +959,36 @@
           <w:sz w:val="24"/>
         </w:rPr>
         <w:t>实验使用 NEU-DET 数据集和本地 RTX 3070 显卡。原始训练集 1440 张，验证集 360 张，ROI 预处理后得到 3172 张缺陷区域样本。分类实验统一使用 128x128 输入、batch size 16、AdamW 优化器、学习率 0.001 和早停策略。评价时使用同一验证集，避免因验证数据变化造成结果不可比。</w:t>
+      </w:r>
+    </w:p>
+    <w:p>
+      <w:pPr>
+        <w:spacing w:line="360" w:lineRule="auto" w:before="0" w:after="0"/>
+        <w:ind w:firstLine="480"/>
+        <w:jc w:val="both"/>
+      </w:pPr>
+      <w:r>
+        <w:rPr>
+          <w:rFonts w:ascii="Times New Roman" w:hAnsi="Times New Roman" w:eastAsia="宋体"/>
+          <w:color w:val="000000"/>
+          <w:sz w:val="24"/>
+        </w:rPr>
+        <w:t>实验设计遵循两个原则。其一，生成模型评价不能只看生成图像的主观观感，因此本课题同时记录 FID、样本筛选通过率和下游分类结果。FID 用于观察生成分布是否逐步接近真实 ROI，分类准确率和混淆矩阵用于判断增强样本是否真的改善任务表现。其二，增强方案之间需要保持训练条件一致。除生成样本数量和来源不同外，分类器结构、验证集、优化器、早停策略和随机种子设置尽量保持一致。这样做虽然不能消除所有随机波动，但可以减少无关变量对结论的影响。</w:t>
+      </w:r>
+    </w:p>
+    <w:p>
+      <w:pPr>
+        <w:spacing w:line="360" w:lineRule="auto" w:before="0" w:after="0"/>
+        <w:ind w:firstLine="480"/>
+        <w:jc w:val="both"/>
+      </w:pPr>
+      <w:r>
+        <w:rPr>
+          <w:rFonts w:ascii="Times New Roman" w:hAnsi="Times New Roman" w:eastAsia="宋体"/>
+          <w:color w:val="000000"/>
+          <w:sz w:val="24"/>
+        </w:rPr>
+        <w:t>在样本组织上，真实样本和生成样本均按六个缺陷类别保存，分类验证阶段再由脚本统一合并训练集。为了避免生成样本数量过大导致类别比例失衡，本课题采用“每类固定数量”的方式构建增强集，并进一步设计每类 25、50、100 张的比例消融。该设置比较贴近工业数据扩充的实际问题：工程人员关心的不是单纯生成尽可能多的图像，而是在有限训练成本下找到较合适的生成样本加入量。</w:t>
       </w:r>
     </w:p>
     <w:p>
@@ -1192,7 +1133,7 @@
           <w:color w:val="000000"/>
           <w:sz w:val="24"/>
         </w:rPr>
-        <w:t>随后进行生成比例消融。固定随机种子 42，从 40 轮 cGAN-v2 每类 100 张导出样本中构建每类 25、50、100 张三个增强子集。结果如下：</w:t>
+        <w:t>随后进行生成比例消融。从 40 轮 cGAN-v2 每类 100 张导出样本中构建每类 25、50、100 张三个增强子集，并使用 42、7、123 三个随机种子复验。结果如下：</w:t>
       </w:r>
     </w:p>
     <w:tbl>
@@ -1203,16 +1144,18 @@
         <w:tblLook w:firstColumn="1" w:firstRow="1" w:lastColumn="0" w:lastRow="0" w:noHBand="0" w:noVBand="1" w:val="04A0"/>
       </w:tblPr>
       <w:tblGrid>
-        <w:gridCol w:w="1746"/>
-        <w:gridCol w:w="1746"/>
-        <w:gridCol w:w="1746"/>
-        <w:gridCol w:w="1746"/>
-        <w:gridCol w:w="1746"/>
+        <w:gridCol w:w="1247"/>
+        <w:gridCol w:w="1247"/>
+        <w:gridCol w:w="1247"/>
+        <w:gridCol w:w="1247"/>
+        <w:gridCol w:w="1247"/>
+        <w:gridCol w:w="1247"/>
+        <w:gridCol w:w="1247"/>
       </w:tblGrid>
       <w:tr>
         <w:tc>
           <w:tcPr>
-            <w:tcW w:type="dxa" w:w="1746"/>
+            <w:tcW w:type="dxa" w:w="1247"/>
             <w:vAlign w:val="center"/>
           </w:tcPr>
           <w:p>
@@ -1233,7 +1176,7 @@
         </w:tc>
         <w:tc>
           <w:tcPr>
-            <w:tcW w:type="dxa" w:w="1746"/>
+            <w:tcW w:type="dxa" w:w="1247"/>
             <w:vAlign w:val="center"/>
           </w:tcPr>
           <w:p>
@@ -1254,7 +1197,7 @@
         </w:tc>
         <w:tc>
           <w:tcPr>
-            <w:tcW w:type="dxa" w:w="1746"/>
+            <w:tcW w:type="dxa" w:w="1247"/>
             <w:vAlign w:val="center"/>
           </w:tcPr>
           <w:p>
@@ -1269,13 +1212,13 @@
                 <w:color w:val="000000"/>
                 <w:sz w:val="21"/>
               </w:rPr>
-              <w:t>最佳验证准确率</w:t>
+              <w:t>种子数</w:t>
             </w:r>
           </w:p>
         </w:tc>
         <w:tc>
           <w:tcPr>
-            <w:tcW w:type="dxa" w:w="1746"/>
+            <w:tcW w:type="dxa" w:w="1247"/>
             <w:vAlign w:val="center"/>
           </w:tcPr>
           <w:p>
@@ -1290,13 +1233,13 @@
                 <w:color w:val="000000"/>
                 <w:sz w:val="21"/>
               </w:rPr>
-              <w:t>最终验证准确率</w:t>
+              <w:t>平均最佳准确率</w:t>
             </w:r>
           </w:p>
         </w:tc>
         <w:tc>
           <w:tcPr>
-            <w:tcW w:type="dxa" w:w="1746"/>
+            <w:tcW w:type="dxa" w:w="1247"/>
             <w:vAlign w:val="center"/>
           </w:tcPr>
           <w:p>
@@ -1311,7 +1254,49 @@
                 <w:color w:val="000000"/>
                 <w:sz w:val="21"/>
               </w:rPr>
-              <w:t>最佳验证损失</w:t>
+              <w:t>标准差</w:t>
+            </w:r>
+          </w:p>
+        </w:tc>
+        <w:tc>
+          <w:tcPr>
+            <w:tcW w:type="dxa" w:w="1247"/>
+            <w:vAlign w:val="center"/>
+          </w:tcPr>
+          <w:p>
+            <w:pPr>
+              <w:jc w:val="center"/>
+            </w:pPr>
+            <w:r/>
+            <w:r>
+              <w:rPr>
+                <w:rFonts w:ascii="Times New Roman" w:hAnsi="Times New Roman" w:eastAsia="黑体"/>
+                <w:b/>
+                <w:color w:val="000000"/>
+                <w:sz w:val="21"/>
+              </w:rPr>
+              <w:t>平均最终准确率</w:t>
+            </w:r>
+          </w:p>
+        </w:tc>
+        <w:tc>
+          <w:tcPr>
+            <w:tcW w:type="dxa" w:w="1247"/>
+            <w:vAlign w:val="center"/>
+          </w:tcPr>
+          <w:p>
+            <w:pPr>
+              <w:jc w:val="center"/>
+            </w:pPr>
+            <w:r/>
+            <w:r>
+              <w:rPr>
+                <w:rFonts w:ascii="Times New Roman" w:hAnsi="Times New Roman" w:eastAsia="黑体"/>
+                <w:b/>
+                <w:color w:val="000000"/>
+                <w:sz w:val="21"/>
+              </w:rPr>
+              <w:t>平均最佳损失</w:t>
             </w:r>
           </w:p>
         </w:tc>
@@ -1319,7 +1304,7 @@
       <w:tr>
         <w:tc>
           <w:tcPr>
-            <w:tcW w:type="dxa" w:w="1746"/>
+            <w:tcW w:type="dxa" w:w="1247"/>
             <w:vAlign w:val="center"/>
           </w:tcPr>
           <w:p>
@@ -1340,7 +1325,7 @@
         </w:tc>
         <w:tc>
           <w:tcPr>
-            <w:tcW w:type="dxa" w:w="1746"/>
+            <w:tcW w:type="dxa" w:w="1247"/>
             <w:vAlign w:val="center"/>
           </w:tcPr>
           <w:p>
@@ -1361,7 +1346,7 @@
         </w:tc>
         <w:tc>
           <w:tcPr>
-            <w:tcW w:type="dxa" w:w="1746"/>
+            <w:tcW w:type="dxa" w:w="1247"/>
             <w:vAlign w:val="center"/>
           </w:tcPr>
           <w:p>
@@ -1376,13 +1361,13 @@
                 <w:color w:val="000000"/>
                 <w:sz w:val="21"/>
               </w:rPr>
-              <w:t>97.22%</w:t>
+              <w:t>3</w:t>
             </w:r>
           </w:p>
         </w:tc>
         <w:tc>
           <w:tcPr>
-            <w:tcW w:type="dxa" w:w="1746"/>
+            <w:tcW w:type="dxa" w:w="1247"/>
             <w:vAlign w:val="center"/>
           </w:tcPr>
           <w:p>
@@ -1397,13 +1382,13 @@
                 <w:color w:val="000000"/>
                 <w:sz w:val="21"/>
               </w:rPr>
-              <w:t>95.00%</w:t>
+              <w:t>91.20%</w:t>
             </w:r>
           </w:p>
         </w:tc>
         <w:tc>
           <w:tcPr>
-            <w:tcW w:type="dxa" w:w="1746"/>
+            <w:tcW w:type="dxa" w:w="1247"/>
             <w:vAlign w:val="center"/>
           </w:tcPr>
           <w:p>
@@ -1418,7 +1403,49 @@
                 <w:color w:val="000000"/>
                 <w:sz w:val="21"/>
               </w:rPr>
-              <w:t>0.1259</w:t>
+              <w:t>6.15%</w:t>
+            </w:r>
+          </w:p>
+        </w:tc>
+        <w:tc>
+          <w:tcPr>
+            <w:tcW w:type="dxa" w:w="1247"/>
+            <w:vAlign w:val="center"/>
+          </w:tcPr>
+          <w:p>
+            <w:pPr>
+              <w:jc w:val="center"/>
+            </w:pPr>
+            <w:r/>
+            <w:r>
+              <w:rPr>
+                <w:rFonts w:ascii="Times New Roman" w:hAnsi="Times New Roman" w:eastAsia="宋体"/>
+                <w:b w:val="0"/>
+                <w:color w:val="000000"/>
+                <w:sz w:val="21"/>
+              </w:rPr>
+              <w:t>86.76%</w:t>
+            </w:r>
+          </w:p>
+        </w:tc>
+        <w:tc>
+          <w:tcPr>
+            <w:tcW w:type="dxa" w:w="1247"/>
+            <w:vAlign w:val="center"/>
+          </w:tcPr>
+          <w:p>
+            <w:pPr>
+              <w:jc w:val="center"/>
+            </w:pPr>
+            <w:r/>
+            <w:r>
+              <w:rPr>
+                <w:rFonts w:ascii="Times New Roman" w:hAnsi="Times New Roman" w:eastAsia="宋体"/>
+                <w:b w:val="0"/>
+                <w:color w:val="000000"/>
+                <w:sz w:val="21"/>
+              </w:rPr>
+              <w:t>0.2589</w:t>
             </w:r>
           </w:p>
         </w:tc>
@@ -1426,7 +1453,7 @@
       <w:tr>
         <w:tc>
           <w:tcPr>
-            <w:tcW w:type="dxa" w:w="1746"/>
+            <w:tcW w:type="dxa" w:w="1247"/>
             <w:vAlign w:val="center"/>
           </w:tcPr>
           <w:p>
@@ -1447,7 +1474,7 @@
         </w:tc>
         <w:tc>
           <w:tcPr>
-            <w:tcW w:type="dxa" w:w="1746"/>
+            <w:tcW w:type="dxa" w:w="1247"/>
             <w:vAlign w:val="center"/>
           </w:tcPr>
           <w:p>
@@ -1468,7 +1495,7 @@
         </w:tc>
         <w:tc>
           <w:tcPr>
-            <w:tcW w:type="dxa" w:w="1746"/>
+            <w:tcW w:type="dxa" w:w="1247"/>
             <w:vAlign w:val="center"/>
           </w:tcPr>
           <w:p>
@@ -1483,13 +1510,13 @@
                 <w:color w:val="000000"/>
                 <w:sz w:val="21"/>
               </w:rPr>
-              <w:t>98.06%</w:t>
+              <w:t>3</w:t>
             </w:r>
           </w:p>
         </w:tc>
         <w:tc>
           <w:tcPr>
-            <w:tcW w:type="dxa" w:w="1746"/>
+            <w:tcW w:type="dxa" w:w="1247"/>
             <w:vAlign w:val="center"/>
           </w:tcPr>
           <w:p>
@@ -1504,13 +1531,13 @@
                 <w:color w:val="000000"/>
                 <w:sz w:val="21"/>
               </w:rPr>
-              <w:t>94.44%</w:t>
+              <w:t>98.70%</w:t>
             </w:r>
           </w:p>
         </w:tc>
         <w:tc>
           <w:tcPr>
-            <w:tcW w:type="dxa" w:w="1746"/>
+            <w:tcW w:type="dxa" w:w="1247"/>
             <w:vAlign w:val="center"/>
           </w:tcPr>
           <w:p>
@@ -1525,7 +1552,49 @@
                 <w:color w:val="000000"/>
                 <w:sz w:val="21"/>
               </w:rPr>
-              <w:t>0.0719</w:t>
+              <w:t>1.16%</w:t>
+            </w:r>
+          </w:p>
+        </w:tc>
+        <w:tc>
+          <w:tcPr>
+            <w:tcW w:type="dxa" w:w="1247"/>
+            <w:vAlign w:val="center"/>
+          </w:tcPr>
+          <w:p>
+            <w:pPr>
+              <w:jc w:val="center"/>
+            </w:pPr>
+            <w:r/>
+            <w:r>
+              <w:rPr>
+                <w:rFonts w:ascii="Times New Roman" w:hAnsi="Times New Roman" w:eastAsia="宋体"/>
+                <w:b w:val="0"/>
+                <w:color w:val="000000"/>
+                <w:sz w:val="21"/>
+              </w:rPr>
+              <w:t>90.28%</w:t>
+            </w:r>
+          </w:p>
+        </w:tc>
+        <w:tc>
+          <w:tcPr>
+            <w:tcW w:type="dxa" w:w="1247"/>
+            <w:vAlign w:val="center"/>
+          </w:tcPr>
+          <w:p>
+            <w:pPr>
+              <w:jc w:val="center"/>
+            </w:pPr>
+            <w:r/>
+            <w:r>
+              <w:rPr>
+                <w:rFonts w:ascii="Times New Roman" w:hAnsi="Times New Roman" w:eastAsia="宋体"/>
+                <w:b w:val="0"/>
+                <w:color w:val="000000"/>
+                <w:sz w:val="21"/>
+              </w:rPr>
+              <w:t>0.0732</w:t>
             </w:r>
           </w:p>
         </w:tc>
@@ -1533,7 +1602,7 @@
       <w:tr>
         <w:tc>
           <w:tcPr>
-            <w:tcW w:type="dxa" w:w="1746"/>
+            <w:tcW w:type="dxa" w:w="1247"/>
             <w:vAlign w:val="center"/>
           </w:tcPr>
           <w:p>
@@ -1554,7 +1623,7 @@
         </w:tc>
         <w:tc>
           <w:tcPr>
-            <w:tcW w:type="dxa" w:w="1746"/>
+            <w:tcW w:type="dxa" w:w="1247"/>
             <w:vAlign w:val="center"/>
           </w:tcPr>
           <w:p>
@@ -1575,7 +1644,7 @@
         </w:tc>
         <w:tc>
           <w:tcPr>
-            <w:tcW w:type="dxa" w:w="1746"/>
+            <w:tcW w:type="dxa" w:w="1247"/>
             <w:vAlign w:val="center"/>
           </w:tcPr>
           <w:p>
@@ -1590,13 +1659,13 @@
                 <w:color w:val="000000"/>
                 <w:sz w:val="21"/>
               </w:rPr>
-              <w:t>99.72%</w:t>
+              <w:t>3</w:t>
             </w:r>
           </w:p>
         </w:tc>
         <w:tc>
           <w:tcPr>
-            <w:tcW w:type="dxa" w:w="1746"/>
+            <w:tcW w:type="dxa" w:w="1247"/>
             <w:vAlign w:val="center"/>
           </w:tcPr>
           <w:p>
@@ -1611,13 +1680,13 @@
                 <w:color w:val="000000"/>
                 <w:sz w:val="21"/>
               </w:rPr>
-              <w:t>98.61%</w:t>
+              <w:t>97.31%</w:t>
             </w:r>
           </w:p>
         </w:tc>
         <w:tc>
           <w:tcPr>
-            <w:tcW w:type="dxa" w:w="1746"/>
+            <w:tcW w:type="dxa" w:w="1247"/>
             <w:vAlign w:val="center"/>
           </w:tcPr>
           <w:p>
@@ -1632,7 +1701,49 @@
                 <w:color w:val="000000"/>
                 <w:sz w:val="21"/>
               </w:rPr>
-              <w:t>0.0533</w:t>
+              <w:t>4.17%</w:t>
+            </w:r>
+          </w:p>
+        </w:tc>
+        <w:tc>
+          <w:tcPr>
+            <w:tcW w:type="dxa" w:w="1247"/>
+            <w:vAlign w:val="center"/>
+          </w:tcPr>
+          <w:p>
+            <w:pPr>
+              <w:jc w:val="center"/>
+            </w:pPr>
+            <w:r/>
+            <w:r>
+              <w:rPr>
+                <w:rFonts w:ascii="Times New Roman" w:hAnsi="Times New Roman" w:eastAsia="宋体"/>
+                <w:b w:val="0"/>
+                <w:color w:val="000000"/>
+                <w:sz w:val="21"/>
+              </w:rPr>
+              <w:t>95.74%</w:t>
+            </w:r>
+          </w:p>
+        </w:tc>
+        <w:tc>
+          <w:tcPr>
+            <w:tcW w:type="dxa" w:w="1247"/>
+            <w:vAlign w:val="center"/>
+          </w:tcPr>
+          <w:p>
+            <w:pPr>
+              <w:jc w:val="center"/>
+            </w:pPr>
+            <w:r/>
+            <w:r>
+              <w:rPr>
+                <w:rFonts w:ascii="Times New Roman" w:hAnsi="Times New Roman" w:eastAsia="宋体"/>
+                <w:b w:val="0"/>
+                <w:color w:val="000000"/>
+                <w:sz w:val="21"/>
+              </w:rPr>
+              <w:t>0.0952</w:t>
             </w:r>
           </w:p>
         </w:tc>
@@ -1651,7 +1762,7 @@
           <w:color w:val="000000"/>
           <w:sz w:val="24"/>
         </w:rPr>
-        <w:t>表中结果显示，40 轮 cGAN-v2 的基础质量提高后，每类 100 张的设置没有出现明显噪声累积，分类器反而获得了更多有效纹理变化。600 张方案在最佳准确率、最终准确率和损失上均优于 150 张和 300 张方案。换句话说，生成样本并不是越少越稳，也不是越多越好；在当前实验条件下，每类 100 张达到了较好的平衡。</w:t>
+        <w:t>表中结果显示，40 轮 cGAN-v2 的基础质量提高后，生成样本加入比例仍然会影响训练稳定性。每类 50 张方案的平均最佳准确率最高，且标准差较低，说明中等规模增强在三次随机训练中更稳；每类 100 张方案在 seed 42 下取得最高单次结果，并且平均最终准确率更高，但 seed 123 下出现回落，说明较大规模生成样本对随机初始化和训练过程更敏感。换句话说，生成样本既不是越少越稳，也不是越多越好，合适比例需要通过多随机种子实验来确认。</w:t>
       </w:r>
     </w:p>
     <w:p>
@@ -1719,7 +1830,7 @@
           <w:color w:val="000000"/>
           <w:sz w:val="24"/>
         </w:rPr>
-        <w:t>该图同时展示最佳验证准确率、最终验证准确率和最佳验证损失。每类 25 张和 50 张方案虽然已经带来一定提升，但最终准确率存在回落；每类 100 张、共 600 张方案在准确率和损失两方面均表现最好，说明当生成模型质量达到一定水平后，适当增加高质量生成样本可以继续改善分类器训练效果。</w:t>
+        <w:t>该图同时展示三随机种子下的平均最佳验证准确率、平均最终验证准确率和平均最佳验证损失。每类 25 张方案样本数量不足，平均准确率和稳定性均偏弱；每类 50 张方案平均最佳准确率最高；每类 100 张方案最终准确率均值更高，但波动也更明显。该结果使论文结论从“单次实验中 600 张最好”进一步修正为“中等比例更稳，较大比例具备潜力但需要工业门槛和多种子结果共同判断”。</w:t>
       </w:r>
     </w:p>
     <w:p>
@@ -1750,7 +1861,7 @@
           <w:color w:val="000000"/>
           <w:sz w:val="24"/>
         </w:rPr>
-        <w:t>为了降低单次训练带来的偶然性，本课题对 600 张方案进行了 3 随机种子复验。结果显示，增强组平均最佳验证准确率为 99.44%，原始基线为 98.15%，平均提升 1.30 个百分点；增强组平均最佳验证损失为 0.0647，低于基线的 0.0941。虽然 3 个种子还不能覆盖所有随机波动，但相比只报告一次训练结果，结论可信度已经明显更高。</w:t>
+        <w:t>为了进一步观察 600 张方案作为工业试运行候选方案的表现，本课题还将其与原始基线进行了 3 随机种子复验。结果显示，增强组平均最佳验证准确率为 99.44%，原始基线为 98.15%，平均提升 1.30 个百分点；增强组平均最佳验证损失为 0.0647，低于基线的 0.0941。需要注意的是，该复验使用的是 600 张方案与基线的直接对照，目的在于判断该候选方案是否优于不加生成样本的训练方式；比例消融复验则用于比较不同生成样本加入量，两者回答的问题并不完全相同。</w:t>
       </w:r>
     </w:p>
     <w:tbl>
@@ -2379,7 +2490,7 @@
           <w:color w:val="000000"/>
           <w:sz w:val="24"/>
         </w:rPr>
-        <w:t>综合实验结果来看，最终提升不是某一个单独技巧带来的。早期 cGAN 已经可以生成样本，但 FID 较高，困难类别纹理偏平滑，下游提升有限；加入 cGAN-v2 后，生成分布有所改善；继续训练到 40 轮后，FID 进一步下降；随后再通过筛选和比例消融确定每类 100 张的加入量，才形成较稳定的下游收益。因此，生成式增强实验不能只写“训练了多少轮”或“生成了多少张”，还需要交代生成质量、筛选策略、增强比例和下游验证设置。</w:t>
+        <w:t>综合实验结果来看，最终提升不是某一个单独技巧带来的。早期 cGAN 已经可以生成样本，但 FID 较高，困难类别纹理偏平滑，下游提升有限；加入 cGAN-v2 后，生成分布有所改善；继续训练到 40 轮后，FID 进一步下降；随后再通过筛选、比例消融和多随机种子复验分析合适加入量，才形成较可靠的下游判断。因此，生成式增强实验不能只写“训练了多少轮”或“生成了多少张”，还需要交代生成质量、筛选策略、增强比例、随机种子和下游验证设置。</w:t>
       </w:r>
     </w:p>
     <w:p>
@@ -2394,7 +2505,7 @@
           <w:color w:val="000000"/>
           <w:sz w:val="24"/>
         </w:rPr>
-        <w:t>与传统增强相比，GAN 增强的优势在于能够提供几何变换之外的新纹理；与此同时，它的风险也更高。生成样本一旦质量不稳定，大量加入训练集可能引入额外噪声。早期实验中，每类 50 张筛选样本比直接加入未经充分筛选的样本更有效，说明“数量越多越好”在这里并不成立。到 40 轮 cGAN-v2 阶段，由于基础质量提高，每类 100 张方案才表现出明显优势。基于这些现象，本文对 GAN 增强给出的结论是有条件的：当生成质量较好、类别较均衡、筛选策略合理并配合早停时，生成样本可以提升分类模型的最佳可达性能。</w:t>
+        <w:t>与传统增强相比，GAN 增强的优势在于能够提供几何变换之外的新纹理；与此同时，它的风险也更高。生成样本一旦质量不稳定，大量加入训练集可能引入额外噪声。早期实验中，每类 50 张筛选样本比直接加入未经充分筛选的样本更有效，说明“数量越多越好”在这里并不成立。到 40 轮 cGAN-v2 阶段，单次实验中 600 张方案表现突出，但三随机种子比例消融显示 300 张方案平均最佳准确率更高、波动更小。基于这些现象，本文对 GAN 增强给出的结论是有条件的：当生成质量较好、类别较均衡、筛选策略合理并配合早停时，生成样本可以提升分类模型的最佳可达性能；若进一步用于工业试运行，还需要结合类别召回率和低置信度样本复核。</w:t>
       </w:r>
     </w:p>
     <w:p>
@@ -2563,6 +2674,36 @@
     </w:p>
     <w:p>
       <w:pPr>
+        <w:spacing w:line="360" w:lineRule="auto" w:before="0" w:after="0"/>
+        <w:ind w:firstLine="480"/>
+        <w:jc w:val="both"/>
+      </w:pPr>
+      <w:r>
+        <w:rPr>
+          <w:rFonts w:ascii="Times New Roman" w:hAnsi="Times New Roman" w:eastAsia="宋体"/>
+          <w:color w:val="000000"/>
+          <w:sz w:val="24"/>
+        </w:rPr>
+        <w:t>为了让测试结果更容易被复查，系统没有只给出单个“运行成功”的提示，而是把关键输出保存为结构化文件。质量评估会写出指标摘要，分类验证会保存训练曲线、混淆矩阵和低置信度样本列表，工业评估会保存门槛判断结果，烟测会生成 JSON 报告。这样做有一个现实好处：论文中引用的图表和数值可以回到文件层面核对，答辩时也能说明每个结论对应哪一次实验输出。</w:t>
+      </w:r>
+    </w:p>
+    <w:p>
+      <w:pPr>
+        <w:spacing w:line="360" w:lineRule="auto" w:before="0" w:after="0"/>
+        <w:ind w:firstLine="480"/>
+        <w:jc w:val="both"/>
+      </w:pPr>
+      <w:r>
+        <w:rPr>
+          <w:rFonts w:ascii="Times New Roman" w:hAnsi="Times New Roman" w:eastAsia="宋体"/>
+          <w:color w:val="000000"/>
+          <w:sz w:val="24"/>
+        </w:rPr>
+        <w:t>测试过程中也暴露出一些需要注意的边界情况。GAN 训练对显存和数据路径较敏感，若模型检查点与当前结构不匹配，需要在界面上给出清晰提示；目标检测 smoke 只能证明流程连通，不能替代正式 mAP 实验；质量指标计算在样本数量较少时波动较大，因此不宜把单次 FID 作为唯一判断标准。针对这些情况，系统在界面和文档中尽量给出限制说明，并通过下游分类验证和多随机种子结果补充证据。整体来看，测试章节的重点不是证明系统没有任何问题，而是说明系统的主要流程可运行、结果可追溯、限制可解释。</w:t>
+      </w:r>
+    </w:p>
+    <w:p>
+      <w:pPr>
         <w:jc w:val="center"/>
       </w:pPr>
       <w:r>
@@ -2677,7 +2818,7 @@
           <w:color w:val="000000"/>
           <w:sz w:val="24"/>
         </w:rPr>
-        <w:t>系统仍有改进空间。600 张方案已经取得较好的分类结果，但同类生成样本之间仍存在相似度偏高的问题，纹理多样性还可以继续提高。比例消融目前主要在 seed 42 下完成，600 张方案虽然已做多随机种子复验，但更完整的实验应对每个比例都进行多种子统计。目标检测验证入口已经补充，不过 GAN 生成样本尚未具备 bbox 标注，现阶段还不能直接证明生成样本对检测 mAP 的提升。ResNet18 和 MobileNetV3-Small 的默认参数表现不如 small CNN，后续需要围绕不同 backbone 单独调整学习率、训练轮数、预训练权重和输入尺寸。</w:t>
+        <w:t>从现有实验看，系统已经形成了较完整的数据增强、质量评价和下游验证链路，但距离真实生产线长期部署仍有差距。第一，数据来源仍以 NEU-DET 为主，虽然该数据集覆盖六类典型金属表面缺陷，但拍摄条件、材质批次和工艺环境相对有限。若换到新的产线、相机或光照系统，生成样本是否仍能带来稳定收益，还需要用企业现场数据重新验证。第二，同类生成样本之间仍存在相似度偏高的问题，尤其是麻点、夹杂等细粒度纹理类别，生成结果有时会呈现局部纹理重复或对比度不足。当前的质量优选能够改善展示效果，但不能完全替代模型层面的多样性提升。</w:t>
       </w:r>
     </w:p>
     <w:p>
@@ -2692,7 +2833,37 @@
           <w:color w:val="000000"/>
           <w:sz w:val="24"/>
         </w:rPr>
-        <w:t>后续工作可以沿三条路线展开。模型方面，可尝试 ACGAN、WGAN-GP、StyleGAN 或扩散模型，以提高缺陷纹理多样性；实验方面，可补充传统增强、GAN 增强和混合增强在检测 mAP 上的对照；系统方面，可加入任务队列、显存监控、Docker 环境、Word/PPT 导出和更完整的实验管理。如果进一步考虑工业落地，低置信度样本人工复核通道应继续保留，并可将复核样本用于主动学习。</w:t>
+        <w:t>第三，比例消融已经补充 42、7、123 三个随机种子复验，但每个比例的种子数量仍然只有 3 个，更严格的实验可以继续增加随机种子，并给出置信区间或显著性检验。第四，目标检测验证入口已经补充，但 GAN 生成样本尚未具备原图坐标系下的 bbox 标注，因此现阶段只能证明检测训练链路可运行，还不能直接证明生成样本对检测 mAP 的提升。第五，ResNet18 和 MobileNetV3-Small 在默认参数下低于 small CNN，说明分类器对比还没有充分调参。这个结果不应简单理解为大模型效果差，更合理的解释是：不同 backbone 对输入尺寸、预训练权重、学习率和训练轮数更敏感，需要单独设计训练方案。</w:t>
+      </w:r>
+    </w:p>
+    <w:p>
+      <w:pPr>
+        <w:spacing w:line="360" w:lineRule="auto" w:before="0" w:after="0"/>
+        <w:ind w:firstLine="480"/>
+        <w:jc w:val="both"/>
+      </w:pPr>
+      <w:r>
+        <w:rPr>
+          <w:rFonts w:ascii="Times New Roman" w:hAnsi="Times New Roman" w:eastAsia="宋体"/>
+          <w:color w:val="000000"/>
+          <w:sz w:val="24"/>
+        </w:rPr>
+        <w:t>评价指标本身也存在边界。FID 能反映真实样本和生成样本在特征空间中的整体距离，但它对样本数量、特征提取网络和图像预处理方式都有依赖；SSIM、PSNR 更适合成对图像评价，用于 GAN 生成样本时只能提供辅助参考。因此，论文没有把单一指标作为最终依据，而是把质量指标、筛选结果、分类验证、类别召回率和低置信度样本分析放在一起讨论。这个处理方式更稳妥，但也意味着后续若进入企业现场，仍需结合人工质检经验和真实漏检成本重新设定评价阈值。</w:t>
+      </w:r>
+    </w:p>
+    <w:p>
+      <w:pPr>
+        <w:spacing w:line="360" w:lineRule="auto" w:before="0" w:after="0"/>
+        <w:ind w:firstLine="480"/>
+        <w:jc w:val="both"/>
+      </w:pPr>
+      <w:r>
+        <w:rPr>
+          <w:rFonts w:ascii="Times New Roman" w:hAnsi="Times New Roman" w:eastAsia="宋体"/>
+          <w:color w:val="000000"/>
+          <w:sz w:val="24"/>
+        </w:rPr>
+        <w:t>后续工作可以沿四条路线继续推进。模型方面，可尝试 ACGAN、WGAN-GP、StyleGAN 或扩散模型，以提高缺陷纹理多样性和类别可控性；实验方面，可补充传统增强、GAN 增强和混合增强在分类准确率、检测 mAP、推理耗时上的系统对照；系统方面，可加入任务队列、显存监控、Docker 环境、Word/PPT 导出和更完整的实验管理；工业应用方面，应保留低置信度样本人工复核通道，将复核后的困难样本用于主动学习和下一轮数据采集。这样处理后，系统不只是一次性实验工具，也可以逐步演化为面向产线数据闭环的辅助平台。</w:t>
       </w:r>
     </w:p>
     <w:p>
@@ -2728,7 +2899,7 @@
           <w:color w:val="000000"/>
           <w:sz w:val="24"/>
         </w:rPr>
-        <w:t>本课题围绕工业表面缺陷样本不足问题，完成了一套基于生成对抗网络的数据增强系统。系统覆盖 NEU-DET 数据读取、ROI 预处理、传统增强、cGAN 生成、质量评估、样本筛选、下游验证和工业就绪度分析等环节。实验结果显示，cGAN-v2 训练 40 轮后，配合质量筛选和合理生成比例，可以提升下游分类性能。每类 100 张、共 600 张生成样本方案在 seed 42 下最佳准确率达到 99.72%，并通过工业门槛；3 随机种子复验中，增强组平均最佳准确率达到 99.44%，高于原始基线的 98.15%。</w:t>
+        <w:t>本课题围绕工业表面缺陷样本不足问题，完成了一套基于生成对抗网络的数据增强系统。系统覆盖 NEU-DET 数据读取、ROI 预处理、传统增强、cGAN 生成、质量评估、样本筛选、下游验证和工业就绪度分析等环节。实验结果显示，cGAN-v2 训练 40 轮后，配合质量筛选和合理生成比例，可以提升下游分类性能。三随机种子比例消融中，每类 50 张方案平均最佳准确率达到 98.70%；每类 100 张、共 600 张生成样本方案在 seed 42 下最佳准确率达到 99.72%，并通过工业门槛。600 张方案与原始基线的 3 随机种子复验中，增强组平均最佳准确率达到 99.44%，高于原始基线的 98.15%。</w:t>
       </w:r>
     </w:p>
     <w:p>

</xml_diff>